<commit_message>
Cover updated to new format
</commit_message>
<xml_diff>
--- a/05_Result/TTS-Dissertation.docx
+++ b/05_Result/TTS-Dissertation.docx
@@ -4,436 +4,355 @@
   <w:body>
     <w:p>
       <w:pPr>
-        <w:tabs>
-          <w:tab w:val="left" w:pos="8808"/>
-        </w:tabs>
-        <w:spacing w:after="0"/>
-        <w:ind w:left="168"/>
-        <w:jc w:val="center"/>
-        <w:rPr>
-          <w:rFonts w:eastAsia="Calibri" w:cs="Times New Roman"/>
+        <w:pStyle w:val="NoSpacing"/>
+        <w:spacing w:line="360" w:lineRule="auto"/>
+        <w:rPr>
+          <w:rFonts w:ascii="Times New Roman" w:hAnsi="Times New Roman"/>
           <w:b/>
-          <w:spacing w:val="-10"/>
+          <w:color w:val="202124"/>
+          <w:sz w:val="28"/>
           <w:szCs w:val="28"/>
+          <w:shd w:val="clear" w:color="auto" w:fill="FFFFFF"/>
         </w:rPr>
       </w:pPr>
       <w:bookmarkStart w:id="0" w:name="_Hlk153286533"/>
       <w:bookmarkStart w:id="1" w:name="OLE_LINK12"/>
-      <w:r>
-        <w:rPr>
-          <w:rFonts w:eastAsia="Calibri" w:cs="Times New Roman"/>
+      <w:bookmarkStart w:id="2" w:name="_Toc102049378"/>
+      <w:bookmarkStart w:id="3" w:name="_Toc98334857"/>
+      <w:r>
+        <w:rPr>
+          <w:rFonts w:ascii="Times New Roman" w:hAnsi="Times New Roman"/>
           <w:b/>
-          <w:spacing w:val="-10"/>
+          <w:color w:val="202124"/>
+          <w:sz w:val="28"/>
           <w:szCs w:val="28"/>
-        </w:rPr>
-        <w:t>MINISTRY OF SCIENCE AND EDUCATION OF THE REPUBLIC OF AZERBAIJAN</w:t>
+          <w:shd w:val="clear" w:color="auto" w:fill="FFFFFF"/>
+        </w:rPr>
+        <w:t>MINISTRY OF SCIENCE AND EDUCATION REPUBLIC OF AZERBAIJAN</w:t>
       </w:r>
     </w:p>
     <w:p>
       <w:pPr>
-        <w:tabs>
-          <w:tab w:val="left" w:pos="8808"/>
-        </w:tabs>
-        <w:spacing w:after="0"/>
-        <w:ind w:left="168"/>
+        <w:pStyle w:val="NoSpacing"/>
+        <w:spacing w:line="360" w:lineRule="auto"/>
         <w:jc w:val="center"/>
         <w:rPr>
-          <w:rFonts w:eastAsia="Calibri" w:cs="Times New Roman"/>
+          <w:rFonts w:ascii="Times New Roman" w:hAnsi="Times New Roman"/>
           <w:b/>
-          <w:spacing w:val="-10"/>
-          <w:szCs w:val="28"/>
+          <w:color w:val="202124"/>
+          <w:sz w:val="24"/>
+          <w:szCs w:val="24"/>
+          <w:shd w:val="clear" w:color="auto" w:fill="FFFFFF"/>
         </w:rPr>
       </w:pPr>
       <w:r>
         <w:rPr>
-          <w:rFonts w:eastAsia="Calibri" w:cs="Times New Roman"/>
+          <w:rFonts w:ascii="Times New Roman" w:hAnsi="Times New Roman"/>
           <w:b/>
-          <w:spacing w:val="-10"/>
-          <w:szCs w:val="28"/>
+          <w:color w:val="202124"/>
+          <w:sz w:val="24"/>
+          <w:szCs w:val="24"/>
+          <w:shd w:val="clear" w:color="auto" w:fill="FFFFFF"/>
         </w:rPr>
         <w:t>AZERBAIJAN STATE UNIVERSITY OF ECONOMICS</w:t>
       </w:r>
     </w:p>
     <w:p>
       <w:pPr>
-        <w:spacing w:after="0"/>
+        <w:pStyle w:val="NoSpacing"/>
+        <w:spacing w:line="360" w:lineRule="auto"/>
         <w:jc w:val="center"/>
         <w:rPr>
-          <w:rFonts w:eastAsia="Calibri" w:cs="Times New Roman"/>
+          <w:rFonts w:ascii="Times New Roman" w:hAnsi="Times New Roman"/>
           <w:b/>
-          <w:color w:val="000000"/>
-          <w:szCs w:val="28"/>
+          <w:color w:val="202124"/>
+          <w:sz w:val="24"/>
+          <w:szCs w:val="24"/>
+          <w:shd w:val="clear" w:color="auto" w:fill="FFFFFF"/>
         </w:rPr>
       </w:pPr>
       <w:r>
         <w:rPr>
-          <w:rFonts w:eastAsia="Calibri" w:cs="Times New Roman"/>
+          <w:rFonts w:ascii="Times New Roman" w:hAnsi="Times New Roman"/>
           <w:b/>
-          <w:color w:val="000000"/>
-          <w:szCs w:val="28"/>
+          <w:color w:val="202124"/>
+          <w:sz w:val="24"/>
+          <w:szCs w:val="24"/>
+          <w:shd w:val="clear" w:color="auto" w:fill="FFFFFF"/>
         </w:rPr>
         <w:t>UNEC BUSINESS SCHOOL</w:t>
       </w:r>
     </w:p>
     <w:p>
       <w:pPr>
-        <w:tabs>
-          <w:tab w:val="left" w:pos="1134"/>
-        </w:tabs>
-        <w:spacing w:after="0"/>
-        <w:ind w:firstLine="567"/>
+        <w:pStyle w:val="NoSpacing"/>
+        <w:spacing w:line="360" w:lineRule="auto"/>
         <w:jc w:val="center"/>
+        <w:rPr>
+          <w:rFonts w:ascii="Times New Roman" w:hAnsi="Times New Roman"/>
+          <w:b/>
+          <w:color w:val="202124"/>
+          <w:sz w:val="24"/>
+          <w:szCs w:val="24"/>
+          <w:shd w:val="clear" w:color="auto" w:fill="FFFFFF"/>
+        </w:rPr>
+      </w:pPr>
+      <w:r>
+        <w:rPr>
+          <w:rFonts w:ascii="Times New Roman" w:hAnsi="Times New Roman"/>
+          <w:b/>
+          <w:color w:val="202124"/>
+          <w:sz w:val="24"/>
+          <w:szCs w:val="24"/>
+          <w:shd w:val="clear" w:color="auto" w:fill="FFFFFF"/>
+        </w:rPr>
+        <w:t>MASTER THESIS</w:t>
+      </w:r>
+    </w:p>
+    <w:p>
+      <w:pPr>
+        <w:pStyle w:val="NoSpacing"/>
+        <w:spacing w:line="360" w:lineRule="auto"/>
+        <w:jc w:val="center"/>
+        <w:rPr>
+          <w:rFonts w:ascii="Times New Roman" w:hAnsi="Times New Roman"/>
+          <w:b/>
+          <w:color w:val="202124"/>
+          <w:sz w:val="24"/>
+          <w:szCs w:val="24"/>
+          <w:shd w:val="clear" w:color="auto" w:fill="FFFFFF"/>
+        </w:rPr>
+      </w:pPr>
+      <w:r>
+        <w:rPr>
+          <w:rFonts w:ascii="Times New Roman" w:hAnsi="Times New Roman"/>
+          <w:b/>
+          <w:color w:val="202124"/>
+          <w:sz w:val="24"/>
+          <w:szCs w:val="24"/>
+          <w:shd w:val="clear" w:color="auto" w:fill="FFFFFF"/>
+        </w:rPr>
+        <w:t>on the topic:</w:t>
+      </w:r>
+    </w:p>
+    <w:p>
+      <w:pPr>
+        <w:pStyle w:val="NoSpacing"/>
+        <w:jc w:val="center"/>
+        <w:rPr>
+          <w:b/>
+          <w:bCs/>
+          <w:color w:val="202124"/>
+          <w:sz w:val="24"/>
+          <w:szCs w:val="24"/>
+          <w:shd w:val="clear" w:color="auto" w:fill="FFFFFF"/>
+        </w:rPr>
+      </w:pPr>
+      <w:r>
+        <w:rPr>
+          <w:rFonts w:ascii="Times New Roman" w:hAnsi="Times New Roman"/>
+          <w:b/>
+          <w:color w:val="202124"/>
+          <w:sz w:val="24"/>
+          <w:szCs w:val="24"/>
+          <w:shd w:val="clear" w:color="auto" w:fill="FFFFFF"/>
+        </w:rPr>
+        <w:t>“</w:t>
+      </w:r>
+      <w:r>
+        <w:rPr>
+          <w:b/>
+          <w:bCs/>
+          <w:color w:val="202124"/>
+          <w:sz w:val="24"/>
+          <w:szCs w:val="24"/>
+          <w:shd w:val="clear" w:color="auto" w:fill="FFFFFF"/>
+        </w:rPr>
+        <w:t>DESIGN AND DEVELOPMENT OF A RULE-BASED</w:t>
+      </w:r>
+    </w:p>
+    <w:p>
+      <w:pPr>
+        <w:pStyle w:val="NoSpacing"/>
+        <w:jc w:val="center"/>
+        <w:rPr>
+          <w:b/>
+          <w:bCs/>
+          <w:color w:val="202124"/>
+          <w:sz w:val="24"/>
+          <w:szCs w:val="24"/>
+          <w:shd w:val="clear" w:color="auto" w:fill="FFFFFF"/>
+        </w:rPr>
+      </w:pPr>
+      <w:r>
+        <w:rPr>
+          <w:b/>
+          <w:bCs/>
+          <w:color w:val="202124"/>
+          <w:sz w:val="24"/>
+          <w:szCs w:val="24"/>
+          <w:shd w:val="clear" w:color="auto" w:fill="FFFFFF"/>
+        </w:rPr>
+        <w:t>TEXT-TO-SPEECH SYSTEM</w:t>
+      </w:r>
+    </w:p>
+    <w:p>
+      <w:pPr>
+        <w:pStyle w:val="NoSpacing"/>
+        <w:spacing w:line="360" w:lineRule="auto"/>
+        <w:jc w:val="center"/>
+        <w:rPr>
+          <w:rFonts w:ascii="Times New Roman" w:hAnsi="Times New Roman"/>
+          <w:b/>
+          <w:color w:val="202124"/>
+          <w:sz w:val="24"/>
+          <w:szCs w:val="24"/>
+          <w:shd w:val="clear" w:color="auto" w:fill="FFFFFF"/>
+        </w:rPr>
+      </w:pPr>
+      <w:r>
+        <w:rPr>
+          <w:rFonts w:ascii="Times New Roman" w:hAnsi="Times New Roman"/>
+          <w:b/>
+          <w:bCs/>
+          <w:color w:val="202124"/>
+          <w:sz w:val="24"/>
+          <w:szCs w:val="24"/>
+          <w:shd w:val="clear" w:color="auto" w:fill="FFFFFF"/>
+        </w:rPr>
+        <w:t>FOR THE AZERBAIJANI LANGUAGE</w:t>
+      </w:r>
+      <w:r>
+        <w:rPr>
+          <w:rFonts w:ascii="Times New Roman" w:hAnsi="Times New Roman"/>
+          <w:b/>
+          <w:color w:val="202124"/>
+          <w:sz w:val="24"/>
+          <w:szCs w:val="24"/>
+          <w:shd w:val="clear" w:color="auto" w:fill="FFFFFF"/>
+        </w:rPr>
+        <w:t>”</w:t>
+      </w:r>
+    </w:p>
+    <w:p>
+      <w:pPr>
+        <w:jc w:val="right"/>
         <w:rPr>
           <w:rFonts w:cs="Times New Roman"/>
           <w:b/>
-          <w:szCs w:val="28"/>
-          <w:lang w:eastAsia="en-GB"/>
+          <w:sz w:val="24"/>
+          <w:szCs w:val="24"/>
         </w:rPr>
       </w:pPr>
       <w:r>
         <w:rPr>
           <w:rFonts w:cs="Times New Roman"/>
           <w:b/>
-          <w:szCs w:val="28"/>
-          <w:lang w:eastAsia="en-GB"/>
-        </w:rPr>
-        <w:t xml:space="preserve">                                               Director of UNEC Business School</w:t>
-      </w:r>
-    </w:p>
-    <w:p>
-      <w:pPr>
-        <w:tabs>
-          <w:tab w:val="left" w:pos="1134"/>
-        </w:tabs>
-        <w:spacing w:after="0"/>
-        <w:ind w:firstLine="567"/>
+          <w:sz w:val="24"/>
+          <w:szCs w:val="24"/>
+        </w:rPr>
+        <w:t>Acting d</w:t>
+      </w:r>
+      <w:r>
         <w:rPr>
           <w:rFonts w:cs="Times New Roman"/>
           <w:b/>
-          <w:szCs w:val="28"/>
-          <w:lang w:eastAsia="en-GB"/>
-        </w:rPr>
-      </w:pPr>
-      <w:r>
+          <w:sz w:val="24"/>
+          <w:szCs w:val="24"/>
+        </w:rPr>
+        <w:t xml:space="preserve">irector of UNEC Business School </w:t>
+      </w:r>
+    </w:p>
+    <w:p>
+      <w:pPr>
+        <w:jc w:val="center"/>
         <w:rPr>
           <w:rFonts w:cs="Times New Roman"/>
           <w:b/>
-          <w:szCs w:val="28"/>
-          <w:lang w:eastAsia="en-GB"/>
-        </w:rPr>
-        <w:tab/>
-      </w:r>
+          <w:sz w:val="24"/>
+          <w:szCs w:val="24"/>
+        </w:rPr>
+      </w:pPr>
       <w:r>
         <w:rPr>
           <w:rFonts w:cs="Times New Roman"/>
           <w:b/>
-          <w:szCs w:val="28"/>
-          <w:lang w:eastAsia="en-GB"/>
-        </w:rPr>
-        <w:tab/>
+          <w:sz w:val="24"/>
+          <w:szCs w:val="24"/>
+        </w:rPr>
+        <w:t xml:space="preserve">                                                                 </w:t>
       </w:r>
       <w:r>
         <w:rPr>
           <w:rFonts w:cs="Times New Roman"/>
           <w:b/>
-          <w:szCs w:val="28"/>
-          <w:lang w:eastAsia="en-GB"/>
-        </w:rPr>
-        <w:tab/>
+          <w:sz w:val="24"/>
+          <w:szCs w:val="24"/>
+        </w:rPr>
+        <w:t xml:space="preserve">                          </w:t>
       </w:r>
       <w:r>
         <w:rPr>
           <w:rFonts w:cs="Times New Roman"/>
           <w:b/>
-          <w:szCs w:val="28"/>
-          <w:lang w:eastAsia="en-GB"/>
-        </w:rPr>
-        <w:tab/>
-      </w:r>
-      <w:r>
-        <w:rPr>
-          <w:rFonts w:cs="Times New Roman"/>
-          <w:b/>
-          <w:szCs w:val="28"/>
-          <w:lang w:eastAsia="en-GB"/>
-        </w:rPr>
-        <w:tab/>
-      </w:r>
-      <w:r>
-        <w:rPr>
-          <w:rFonts w:cs="Times New Roman"/>
-          <w:b/>
-          <w:szCs w:val="28"/>
-          <w:lang w:eastAsia="en-GB"/>
-        </w:rPr>
-        <w:tab/>
-        <w:t xml:space="preserve">  </w:t>
-      </w:r>
-      <w:r>
-        <w:rPr>
-          <w:rFonts w:cs="Times New Roman"/>
-          <w:b/>
-          <w:szCs w:val="28"/>
-          <w:lang w:eastAsia="en-GB"/>
-        </w:rPr>
-        <w:tab/>
-        <w:t>Assoc. Prof. Nazim Ozbay Hajiyev</w:t>
-      </w:r>
-    </w:p>
-    <w:p>
-      <w:pPr>
-        <w:tabs>
-          <w:tab w:val="left" w:pos="1134"/>
-        </w:tabs>
-        <w:spacing w:after="0"/>
-        <w:ind w:firstLine="567"/>
-        <w:rPr>
-          <w:rFonts w:cs="Times New Roman"/>
-          <w:b/>
-          <w:szCs w:val="28"/>
-          <w:lang w:eastAsia="en-GB"/>
-        </w:rPr>
-      </w:pPr>
-      <w:r>
-        <w:rPr>
-          <w:rFonts w:cs="Times New Roman"/>
-          <w:b/>
-          <w:szCs w:val="28"/>
-          <w:lang w:eastAsia="en-GB"/>
-        </w:rPr>
-        <w:tab/>
-      </w:r>
-      <w:r>
-        <w:rPr>
-          <w:rFonts w:cs="Times New Roman"/>
-          <w:b/>
-          <w:szCs w:val="28"/>
-          <w:lang w:eastAsia="en-GB"/>
-        </w:rPr>
-        <w:tab/>
-      </w:r>
-      <w:r>
-        <w:rPr>
-          <w:rFonts w:cs="Times New Roman"/>
-          <w:b/>
-          <w:szCs w:val="28"/>
-          <w:lang w:eastAsia="en-GB"/>
-        </w:rPr>
-        <w:tab/>
-      </w:r>
-      <w:r>
-        <w:rPr>
-          <w:rFonts w:cs="Times New Roman"/>
-          <w:b/>
-          <w:szCs w:val="28"/>
-          <w:lang w:eastAsia="en-GB"/>
-        </w:rPr>
-        <w:tab/>
-      </w:r>
-      <w:r>
-        <w:rPr>
-          <w:rFonts w:cs="Times New Roman"/>
-          <w:b/>
-          <w:szCs w:val="28"/>
-          <w:lang w:eastAsia="en-GB"/>
-        </w:rPr>
-        <w:tab/>
-      </w:r>
-      <w:r>
-        <w:rPr>
-          <w:rFonts w:cs="Times New Roman"/>
-          <w:b/>
-          <w:szCs w:val="28"/>
-          <w:lang w:eastAsia="en-GB"/>
-        </w:rPr>
-        <w:tab/>
-        <w:t xml:space="preserve">  </w:t>
-      </w:r>
-      <w:r>
-        <w:rPr>
-          <w:rFonts w:cs="Times New Roman"/>
-          <w:b/>
-          <w:szCs w:val="28"/>
-          <w:lang w:eastAsia="en-GB"/>
-        </w:rPr>
-        <w:tab/>
-        <w:t>(Signature) _______________</w:t>
-      </w:r>
-    </w:p>
-    <w:p>
-      <w:pPr>
-        <w:tabs>
-          <w:tab w:val="left" w:pos="1134"/>
-        </w:tabs>
-        <w:spacing w:after="0"/>
-        <w:ind w:firstLine="567"/>
-        <w:rPr>
-          <w:rFonts w:cs="Times New Roman"/>
-          <w:b/>
-          <w:szCs w:val="28"/>
-          <w:u w:val="single"/>
-          <w:lang w:eastAsia="en-GB"/>
-        </w:rPr>
-      </w:pPr>
-    </w:p>
-    <w:p>
-      <w:pPr>
-        <w:tabs>
-          <w:tab w:val="left" w:pos="1134"/>
-        </w:tabs>
-        <w:spacing w:after="0"/>
-        <w:ind w:firstLine="567"/>
-        <w:rPr>
-          <w:rFonts w:cs="Times New Roman"/>
-          <w:b/>
-          <w:szCs w:val="28"/>
-          <w:lang w:eastAsia="en-GB"/>
-        </w:rPr>
-      </w:pPr>
-      <w:r>
-        <w:rPr>
-          <w:rFonts w:cs="Times New Roman"/>
-          <w:b/>
-          <w:szCs w:val="28"/>
-          <w:lang w:eastAsia="en-GB"/>
-        </w:rPr>
-        <w:tab/>
-      </w:r>
-      <w:r>
-        <w:rPr>
-          <w:rFonts w:cs="Times New Roman"/>
-          <w:b/>
-          <w:szCs w:val="28"/>
-          <w:lang w:eastAsia="en-GB"/>
-        </w:rPr>
-        <w:tab/>
-      </w:r>
-      <w:r>
-        <w:rPr>
-          <w:rFonts w:cs="Times New Roman"/>
-          <w:b/>
-          <w:szCs w:val="28"/>
-          <w:lang w:eastAsia="en-GB"/>
-        </w:rPr>
-        <w:tab/>
-      </w:r>
-      <w:r>
-        <w:rPr>
-          <w:rFonts w:cs="Times New Roman"/>
-          <w:b/>
-          <w:szCs w:val="28"/>
-          <w:lang w:eastAsia="en-GB"/>
-        </w:rPr>
-        <w:tab/>
-      </w:r>
-      <w:r>
-        <w:rPr>
-          <w:rFonts w:cs="Times New Roman"/>
-          <w:b/>
-          <w:szCs w:val="28"/>
-          <w:lang w:eastAsia="en-GB"/>
-        </w:rPr>
-        <w:tab/>
-      </w:r>
-      <w:r>
-        <w:rPr>
-          <w:rFonts w:cs="Times New Roman"/>
-          <w:b/>
-          <w:szCs w:val="28"/>
-          <w:lang w:eastAsia="en-GB"/>
-        </w:rPr>
-        <w:tab/>
-        <w:t>Date: “_____” ________________ 202</w:t>
-      </w:r>
-      <w:r>
-        <w:rPr>
-          <w:rFonts w:cs="Times New Roman"/>
-          <w:b/>
-          <w:szCs w:val="28"/>
-          <w:lang w:eastAsia="en-GB"/>
-        </w:rPr>
-        <w:t>6</w:t>
-      </w:r>
-    </w:p>
-    <w:p>
-      <w:pPr>
-        <w:tabs>
-          <w:tab w:val="left" w:pos="8808"/>
-        </w:tabs>
-        <w:spacing w:after="0"/>
-        <w:ind w:left="168"/>
-        <w:jc w:val="center"/>
-        <w:rPr>
-          <w:rFonts w:eastAsia="Calibri" w:cs="Times New Roman"/>
-          <w:b/>
-          <w:spacing w:val="-10"/>
-          <w:szCs w:val="28"/>
-        </w:rPr>
-      </w:pPr>
-      <w:bookmarkStart w:id="2" w:name="_Hlk169155948"/>
-    </w:p>
-    <w:p>
-      <w:pPr>
-        <w:tabs>
-          <w:tab w:val="left" w:pos="8808"/>
-        </w:tabs>
-        <w:spacing w:after="0"/>
-        <w:ind w:left="168"/>
-        <w:jc w:val="center"/>
-        <w:rPr>
-          <w:rFonts w:eastAsia="Calibri" w:cs="Times New Roman"/>
-          <w:b/>
-          <w:spacing w:val="-10"/>
-          <w:szCs w:val="28"/>
-        </w:rPr>
-      </w:pPr>
-      <w:r>
-        <w:rPr>
-          <w:rFonts w:eastAsia="Calibri" w:cs="Times New Roman"/>
-          <w:b/>
-          <w:spacing w:val="-10"/>
-          <w:szCs w:val="28"/>
-        </w:rPr>
-        <w:t>About topic of</w:t>
-      </w:r>
-    </w:p>
-    <w:bookmarkEnd w:id="2"/>
-    <w:p>
-      <w:pPr>
-        <w:jc w:val="center"/>
-        <w:rPr>
+          <w:sz w:val="24"/>
+          <w:szCs w:val="24"/>
+        </w:rPr>
+        <w:t xml:space="preserve"> </w:t>
+      </w:r>
+      <w:r>
+        <w:rPr>
+          <w:rStyle w:val="Emphasis"/>
           <w:rFonts w:cs="Times New Roman"/>
           <w:b/>
           <w:bCs/>
-          <w:szCs w:val="28"/>
-        </w:rPr>
-      </w:pPr>
-      <w:r>
-        <w:rPr>
-          <w:rFonts w:eastAsia="Calibri" w:cs="Times New Roman"/>
-          <w:b/>
-          <w:spacing w:val="-10"/>
-          <w:szCs w:val="28"/>
-        </w:rPr>
-        <w:t>“</w:t>
-      </w:r>
-      <w:r>
-        <w:rPr>
+          <w:sz w:val="24"/>
+          <w:szCs w:val="24"/>
+          <w:shd w:val="clear" w:color="auto" w:fill="FFFFFF"/>
+        </w:rPr>
+        <w:t>A</w:t>
+      </w:r>
+      <w:r>
+        <w:rPr>
+          <w:rStyle w:val="Emphasis"/>
           <w:rFonts w:cs="Times New Roman"/>
           <w:b/>
           <w:bCs/>
-          <w:szCs w:val="28"/>
-        </w:rPr>
-        <w:t>DESIGN AND DEVELOPMENT OF A RULE-BASED</w:t>
-      </w:r>
-      <w:r>
-        <w:rPr>
+          <w:sz w:val="24"/>
+          <w:szCs w:val="24"/>
+          <w:shd w:val="clear" w:color="auto" w:fill="FFFFFF"/>
+        </w:rPr>
+        <w:t>ssoc</w:t>
+      </w:r>
+      <w:r>
+        <w:rPr>
+          <w:rFonts w:cs="Times New Roman"/>
+          <w:sz w:val="24"/>
+          <w:szCs w:val="24"/>
+          <w:shd w:val="clear" w:color="auto" w:fill="FFFFFF"/>
+        </w:rPr>
+        <w:t>. </w:t>
+      </w:r>
+      <w:r>
+        <w:rPr>
+          <w:rStyle w:val="Emphasis"/>
           <w:rFonts w:cs="Times New Roman"/>
           <w:b/>
           <w:bCs/>
-          <w:szCs w:val="28"/>
-        </w:rPr>
-        <w:t xml:space="preserve"> </w:t>
+          <w:sz w:val="24"/>
+          <w:szCs w:val="24"/>
+          <w:shd w:val="clear" w:color="auto" w:fill="FFFFFF"/>
+        </w:rPr>
+        <w:t xml:space="preserve">prof. </w:t>
+      </w:r>
+      <w:r>
+        <w:rPr>
+          <w:rFonts w:cs="Times New Roman"/>
+          <w:b/>
+          <w:sz w:val="24"/>
+          <w:szCs w:val="24"/>
+        </w:rPr>
+        <w:t>Geray Musayev</w:t>
       </w:r>
     </w:p>
     <w:p>
@@ -442,147 +361,360 @@
         <w:rPr>
           <w:rFonts w:cs="Times New Roman"/>
           <w:b/>
-          <w:bCs/>
-          <w:szCs w:val="28"/>
+          <w:sz w:val="24"/>
+          <w:szCs w:val="24"/>
         </w:rPr>
       </w:pPr>
       <w:r>
         <w:rPr>
           <w:rFonts w:cs="Times New Roman"/>
           <w:b/>
-          <w:bCs/>
-          <w:szCs w:val="28"/>
-        </w:rPr>
-        <w:t>TEXT-TO-SPEECH SYSTEM</w:t>
-      </w:r>
-      <w:r>
+          <w:sz w:val="24"/>
+          <w:szCs w:val="24"/>
+        </w:rPr>
+        <w:t xml:space="preserve">                                                                                                     “_______________” (signature) </w:t>
+      </w:r>
+    </w:p>
+    <w:p>
+      <w:pPr>
+        <w:jc w:val="center"/>
         <w:rPr>
           <w:rFonts w:cs="Times New Roman"/>
           <w:b/>
-          <w:bCs/>
-          <w:szCs w:val="28"/>
-        </w:rPr>
-        <w:t xml:space="preserve"> </w:t>
-      </w:r>
-    </w:p>
-    <w:p>
-      <w:pPr>
-        <w:jc w:val="center"/>
+          <w:sz w:val="24"/>
+          <w:szCs w:val="24"/>
+        </w:rPr>
+      </w:pPr>
+      <w:r>
         <w:rPr>
           <w:rFonts w:cs="Times New Roman"/>
           <w:b/>
-          <w:bCs/>
-          <w:szCs w:val="28"/>
-        </w:rPr>
-      </w:pPr>
+          <w:sz w:val="24"/>
+          <w:szCs w:val="24"/>
+        </w:rPr>
+        <w:t xml:space="preserve">                                                                                            </w:t>
+      </w:r>
       <w:r>
         <w:rPr>
           <w:rFonts w:cs="Times New Roman"/>
           <w:b/>
-          <w:bCs/>
-          <w:szCs w:val="28"/>
-        </w:rPr>
-        <w:t>FOR THE</w:t>
-      </w:r>
-      <w:r>
-        <w:rPr>
-          <w:rFonts w:cs="Times New Roman"/>
+          <w:sz w:val="24"/>
+          <w:szCs w:val="24"/>
+        </w:rPr>
+        <w:t xml:space="preserve">         “___” ____________ 2026</w:t>
+      </w:r>
+    </w:p>
+    <w:p>
+      <w:pPr>
+        <w:pStyle w:val="NoSpacing"/>
+        <w:spacing w:line="360" w:lineRule="auto"/>
+        <w:rPr>
+          <w:rFonts w:ascii="Times New Roman" w:hAnsi="Times New Roman"/>
           <w:b/>
-          <w:bCs/>
-          <w:szCs w:val="28"/>
-        </w:rPr>
-        <w:t xml:space="preserve"> </w:t>
-      </w:r>
-      <w:r>
-        <w:rPr>
-          <w:rFonts w:cs="Times New Roman"/>
+          <w:color w:val="202124"/>
+          <w:sz w:val="24"/>
+          <w:szCs w:val="24"/>
+          <w:shd w:val="clear" w:color="auto" w:fill="FFFFFF"/>
+          <w:lang w:val="az-Latn-AZ"/>
+        </w:rPr>
+      </w:pPr>
+    </w:p>
+    <w:p>
+      <w:pPr>
+        <w:pStyle w:val="NoSpacing"/>
+        <w:spacing w:line="360" w:lineRule="auto"/>
+        <w:rPr>
+          <w:rFonts w:ascii="Times New Roman" w:hAnsi="Times New Roman"/>
           <w:b/>
-          <w:bCs/>
-          <w:szCs w:val="28"/>
-        </w:rPr>
-        <w:t>AZERBAIJANI LANGUAGE</w:t>
-      </w:r>
-      <w:r>
-        <w:rPr>
-          <w:rFonts w:eastAsia="Calibri" w:cs="Times New Roman"/>
+          <w:color w:val="202124"/>
+          <w:sz w:val="24"/>
+          <w:szCs w:val="24"/>
+          <w:shd w:val="clear" w:color="auto" w:fill="FFFFFF"/>
+          <w:lang w:val="az-Latn-AZ"/>
+        </w:rPr>
+      </w:pPr>
+    </w:p>
+    <w:p>
+      <w:pPr>
+        <w:pStyle w:val="NoSpacing"/>
+        <w:spacing w:line="360" w:lineRule="auto"/>
+        <w:rPr>
+          <w:rFonts w:ascii="Times New Roman" w:hAnsi="Times New Roman"/>
           <w:b/>
-          <w:spacing w:val="-10"/>
-          <w:szCs w:val="28"/>
-        </w:rPr>
-        <w:t>”</w:t>
+          <w:color w:val="202124"/>
+          <w:sz w:val="24"/>
+          <w:szCs w:val="24"/>
+          <w:shd w:val="clear" w:color="auto" w:fill="FFFFFF"/>
+          <w:lang w:val="az-Latn-AZ"/>
+        </w:rPr>
+      </w:pPr>
+      <w:r>
+        <w:rPr>
+          <w:rFonts w:ascii="Times New Roman" w:hAnsi="Times New Roman"/>
+          <w:b/>
+          <w:color w:val="202124"/>
+          <w:sz w:val="24"/>
+          <w:szCs w:val="24"/>
+          <w:shd w:val="clear" w:color="auto" w:fill="FFFFFF"/>
+          <w:lang w:val="az-Latn-AZ"/>
+        </w:rPr>
+        <w:t xml:space="preserve">Code of specialisation and name: </w:t>
+      </w:r>
+      <w:r>
+        <w:rPr>
+          <w:rFonts w:ascii="Times New Roman" w:hAnsi="Times New Roman"/>
+          <w:b/>
+          <w:color w:val="202124"/>
+          <w:sz w:val="24"/>
+          <w:szCs w:val="24"/>
+          <w:shd w:val="clear" w:color="auto" w:fill="FFFFFF"/>
+          <w:lang w:val="az-Latn-AZ"/>
+        </w:rPr>
+        <w:tab/>
+      </w:r>
+      <w:r>
+        <w:rPr>
+          <w:rFonts w:ascii="Times New Roman" w:hAnsi="Times New Roman"/>
+          <w:b/>
+          <w:color w:val="202124"/>
+          <w:sz w:val="24"/>
+          <w:szCs w:val="24"/>
+          <w:shd w:val="clear" w:color="auto" w:fill="FFFFFF"/>
+          <w:lang w:val="az-Latn-AZ"/>
+        </w:rPr>
+        <w:tab/>
+      </w:r>
+      <w:r>
+        <w:rPr>
+          <w:rFonts w:ascii="Times New Roman" w:hAnsi="Times New Roman"/>
+          <w:b/>
+          <w:color w:val="202124"/>
+          <w:sz w:val="24"/>
+          <w:szCs w:val="24"/>
+          <w:shd w:val="clear" w:color="auto" w:fill="FFFFFF"/>
+          <w:lang w:val="az-Latn-AZ"/>
+        </w:rPr>
+        <w:tab/>
+      </w:r>
+      <w:r>
+        <w:rPr>
+          <w:rFonts w:ascii="Times New Roman" w:hAnsi="Times New Roman"/>
+          <w:b/>
+          <w:color w:val="202124"/>
+          <w:sz w:val="24"/>
+          <w:szCs w:val="24"/>
+          <w:shd w:val="clear" w:color="auto" w:fill="FFFFFF"/>
+          <w:lang w:val="az-Latn-AZ"/>
+        </w:rPr>
+        <w:t xml:space="preserve">060409 Business administration </w:t>
       </w:r>
     </w:p>
     <w:p>
       <w:pPr>
-        <w:tabs>
-          <w:tab w:val="left" w:pos="8808"/>
-        </w:tabs>
-        <w:spacing w:after="0"/>
-        <w:ind w:left="168"/>
-        <w:jc w:val="center"/>
-        <w:rPr>
-          <w:rFonts w:eastAsia="Calibri" w:cs="Times New Roman"/>
+        <w:pStyle w:val="NoSpacing"/>
+        <w:spacing w:line="360" w:lineRule="auto"/>
+        <w:rPr>
+          <w:rFonts w:ascii="Times New Roman" w:hAnsi="Times New Roman"/>
           <w:b/>
-          <w:spacing w:val="-10"/>
-          <w:szCs w:val="28"/>
+          <w:color w:val="202124"/>
+          <w:sz w:val="24"/>
+          <w:szCs w:val="24"/>
+          <w:shd w:val="clear" w:color="auto" w:fill="FFFFFF"/>
+          <w:lang w:val="az-Latn-AZ"/>
         </w:rPr>
       </w:pPr>
       <w:r>
         <w:rPr>
-          <w:rFonts w:eastAsia="Calibri" w:cs="Times New Roman"/>
+          <w:rFonts w:ascii="Times New Roman" w:hAnsi="Times New Roman"/>
           <w:b/>
-          <w:spacing w:val="-10"/>
-          <w:szCs w:val="28"/>
-        </w:rPr>
-        <w:t>MASTER’S THESIS</w:t>
-      </w:r>
-    </w:p>
-    <w:p>
-      <w:pPr>
-        <w:spacing w:before="2" w:after="0"/>
-        <w:rPr>
-          <w:rFonts w:eastAsia="Arial MT" w:cs="Times New Roman"/>
+          <w:color w:val="202124"/>
+          <w:sz w:val="24"/>
+          <w:szCs w:val="24"/>
+          <w:shd w:val="clear" w:color="auto" w:fill="FFFFFF"/>
+          <w:lang w:val="az-Latn-AZ"/>
+        </w:rPr>
+        <w:t xml:space="preserve">Specialisation: </w:t>
+      </w:r>
+      <w:r>
+        <w:rPr>
+          <w:rFonts w:ascii="Times New Roman" w:hAnsi="Times New Roman"/>
           <w:b/>
-        </w:rPr>
-      </w:pPr>
-    </w:p>
-    <w:p>
-      <w:pPr>
-        <w:tabs>
-          <w:tab w:val="left" w:pos="5603"/>
-        </w:tabs>
-        <w:spacing w:after="0"/>
-        <w:ind w:left="-450"/>
-        <w:rPr>
-          <w:rFonts w:eastAsia="Calibri" w:cs="Times New Roman"/>
+          <w:color w:val="202124"/>
+          <w:sz w:val="24"/>
+          <w:szCs w:val="24"/>
+          <w:shd w:val="clear" w:color="auto" w:fill="FFFFFF"/>
+          <w:lang w:val="az-Latn-AZ"/>
+        </w:rPr>
+        <w:tab/>
+      </w:r>
+      <w:r>
+        <w:rPr>
+          <w:rFonts w:ascii="Times New Roman" w:hAnsi="Times New Roman"/>
           <w:b/>
-          <w:szCs w:val="28"/>
-        </w:rPr>
-      </w:pPr>
-      <w:r>
-        <w:rPr>
-          <w:rFonts w:eastAsia="Calibri" w:cs="Times New Roman"/>
+          <w:color w:val="202124"/>
+          <w:sz w:val="24"/>
+          <w:szCs w:val="24"/>
+          <w:shd w:val="clear" w:color="auto" w:fill="FFFFFF"/>
+          <w:lang w:val="az-Latn-AZ"/>
+        </w:rPr>
+        <w:tab/>
+      </w:r>
+      <w:r>
+        <w:rPr>
+          <w:rFonts w:ascii="Times New Roman" w:hAnsi="Times New Roman"/>
           <w:b/>
-          <w:szCs w:val="28"/>
-        </w:rPr>
-        <w:t>Specialty Code and Title: 060409_Business Management</w:t>
-      </w:r>
-    </w:p>
-    <w:p>
-      <w:pPr>
-        <w:tabs>
-          <w:tab w:val="left" w:pos="5603"/>
-        </w:tabs>
-        <w:spacing w:after="0"/>
-        <w:ind w:left="-450"/>
+          <w:color w:val="202124"/>
+          <w:sz w:val="24"/>
+          <w:szCs w:val="24"/>
+          <w:shd w:val="clear" w:color="auto" w:fill="FFFFFF"/>
+          <w:lang w:val="az-Latn-AZ"/>
+        </w:rPr>
+        <w:tab/>
+      </w:r>
+      <w:r>
+        <w:rPr>
+          <w:rFonts w:ascii="Times New Roman" w:hAnsi="Times New Roman"/>
+          <w:b/>
+          <w:color w:val="202124"/>
+          <w:sz w:val="24"/>
+          <w:szCs w:val="24"/>
+          <w:shd w:val="clear" w:color="auto" w:fill="FFFFFF"/>
+          <w:lang w:val="az-Latn-AZ"/>
+        </w:rPr>
+        <w:tab/>
+      </w:r>
+      <w:r>
+        <w:rPr>
+          <w:rFonts w:ascii="Times New Roman" w:hAnsi="Times New Roman"/>
+          <w:b/>
+          <w:color w:val="202124"/>
+          <w:sz w:val="24"/>
+          <w:szCs w:val="24"/>
+          <w:shd w:val="clear" w:color="auto" w:fill="FFFFFF"/>
+          <w:lang w:val="az-Latn-AZ"/>
+        </w:rPr>
+        <w:tab/>
+      </w:r>
+      <w:r>
         <w:rPr>
           <w:rFonts w:eastAsia="Calibri" w:cs="Times New Roman"/>
           <w:b/>
           <w:bCs/>
           <w:szCs w:val="28"/>
-          <w:highlight w:val="yellow"/>
+        </w:rPr>
+        <w:t>Artificial Intelligence</w:t>
+      </w:r>
+      <w:r>
+        <w:rPr>
+          <w:rFonts w:ascii="Times New Roman" w:hAnsi="Times New Roman"/>
+          <w:b/>
+          <w:color w:val="202124"/>
+          <w:sz w:val="24"/>
+          <w:szCs w:val="24"/>
+          <w:shd w:val="clear" w:color="auto" w:fill="FFFFFF"/>
+          <w:lang w:val="az-Latn-AZ"/>
+        </w:rPr>
+        <w:t xml:space="preserve"> </w:t>
+      </w:r>
+    </w:p>
+    <w:p>
+      <w:pPr>
+        <w:pStyle w:val="NoSpacing"/>
+        <w:spacing w:line="360" w:lineRule="auto"/>
+        <w:rPr>
+          <w:rFonts w:ascii="Times New Roman" w:hAnsi="Times New Roman"/>
+          <w:b/>
+          <w:color w:val="202124"/>
+          <w:sz w:val="24"/>
+          <w:szCs w:val="24"/>
+          <w:shd w:val="clear" w:color="auto" w:fill="FFFFFF"/>
+          <w:lang w:val="az-Latn-AZ"/>
         </w:rPr>
       </w:pPr>
+      <w:r>
+        <w:rPr>
+          <w:rFonts w:ascii="Times New Roman" w:hAnsi="Times New Roman"/>
+          <w:b/>
+          <w:color w:val="202124"/>
+          <w:sz w:val="24"/>
+          <w:szCs w:val="24"/>
+          <w:shd w:val="clear" w:color="auto" w:fill="FFFFFF"/>
+          <w:lang w:val="az-Latn-AZ"/>
+        </w:rPr>
+        <w:t>Group:</w:t>
+      </w:r>
+      <w:r>
+        <w:rPr>
+          <w:rFonts w:ascii="Times New Roman" w:hAnsi="Times New Roman"/>
+          <w:b/>
+          <w:color w:val="202124"/>
+          <w:sz w:val="24"/>
+          <w:szCs w:val="24"/>
+          <w:shd w:val="clear" w:color="auto" w:fill="FFFFFF"/>
+          <w:lang w:val="az-Latn-AZ"/>
+        </w:rPr>
+        <w:t xml:space="preserve">                  </w:t>
+      </w:r>
+      <w:r>
+        <w:rPr>
+          <w:rFonts w:ascii="Times New Roman" w:hAnsi="Times New Roman"/>
+          <w:b/>
+          <w:color w:val="202124"/>
+          <w:sz w:val="24"/>
+          <w:szCs w:val="24"/>
+          <w:shd w:val="clear" w:color="auto" w:fill="FFFFFF"/>
+          <w:lang w:val="az-Latn-AZ"/>
+        </w:rPr>
+        <w:tab/>
+      </w:r>
+      <w:r>
+        <w:rPr>
+          <w:rFonts w:ascii="Times New Roman" w:hAnsi="Times New Roman"/>
+          <w:b/>
+          <w:color w:val="202124"/>
+          <w:sz w:val="24"/>
+          <w:szCs w:val="24"/>
+          <w:shd w:val="clear" w:color="auto" w:fill="FFFFFF"/>
+          <w:lang w:val="az-Latn-AZ"/>
+        </w:rPr>
+        <w:tab/>
+      </w:r>
+      <w:r>
+        <w:rPr>
+          <w:rFonts w:ascii="Times New Roman" w:hAnsi="Times New Roman"/>
+          <w:b/>
+          <w:color w:val="202124"/>
+          <w:sz w:val="24"/>
+          <w:szCs w:val="24"/>
+          <w:shd w:val="clear" w:color="auto" w:fill="FFFFFF"/>
+          <w:lang w:val="az-Latn-AZ"/>
+        </w:rPr>
+        <w:tab/>
+      </w:r>
+      <w:r>
+        <w:rPr>
+          <w:rFonts w:ascii="Times New Roman" w:hAnsi="Times New Roman"/>
+          <w:b/>
+          <w:color w:val="202124"/>
+          <w:sz w:val="24"/>
+          <w:szCs w:val="24"/>
+          <w:shd w:val="clear" w:color="auto" w:fill="FFFFFF"/>
+          <w:lang w:val="az-Latn-AZ"/>
+        </w:rPr>
+        <w:tab/>
+      </w:r>
+      <w:r>
+        <w:rPr>
+          <w:rFonts w:ascii="Times New Roman" w:hAnsi="Times New Roman"/>
+          <w:b/>
+          <w:color w:val="202124"/>
+          <w:sz w:val="24"/>
+          <w:szCs w:val="24"/>
+          <w:shd w:val="clear" w:color="auto" w:fill="FFFFFF"/>
+          <w:lang w:val="az-Latn-AZ"/>
+        </w:rPr>
+        <w:tab/>
+      </w:r>
       <w:r>
         <w:rPr>
           <w:rFonts w:eastAsia="Calibri" w:cs="Times New Roman"/>
@@ -590,8 +722,126 @@
           <w:bCs/>
           <w:szCs w:val="28"/>
         </w:rPr>
-        <w:t xml:space="preserve">Specialization: </w:t>
-      </w:r>
+        <w:t>E27-24</w:t>
+      </w:r>
+    </w:p>
+    <w:p>
+      <w:pPr>
+        <w:pStyle w:val="NoSpacing"/>
+        <w:spacing w:line="360" w:lineRule="auto"/>
+        <w:rPr>
+          <w:rFonts w:ascii="Times New Roman" w:hAnsi="Times New Roman"/>
+          <w:b/>
+          <w:color w:val="202124"/>
+          <w:sz w:val="24"/>
+          <w:szCs w:val="24"/>
+          <w:shd w:val="clear" w:color="auto" w:fill="FFFFFF"/>
+          <w:lang w:val="az-Latn-AZ"/>
+        </w:rPr>
+      </w:pPr>
+    </w:p>
+    <w:p>
+      <w:pPr>
+        <w:pStyle w:val="NoSpacing"/>
+        <w:spacing w:line="360" w:lineRule="auto"/>
+        <w:rPr>
+          <w:rFonts w:ascii="Times New Roman" w:hAnsi="Times New Roman"/>
+          <w:b/>
+          <w:color w:val="202124"/>
+          <w:sz w:val="24"/>
+          <w:szCs w:val="24"/>
+          <w:shd w:val="clear" w:color="auto" w:fill="FFFFFF"/>
+          <w:lang w:val="az-Latn-AZ"/>
+        </w:rPr>
+      </w:pPr>
+    </w:p>
+    <w:p>
+      <w:pPr>
+        <w:pStyle w:val="NoSpacing"/>
+        <w:spacing w:line="360" w:lineRule="auto"/>
+        <w:rPr>
+          <w:rFonts w:ascii="Times New Roman" w:hAnsi="Times New Roman"/>
+          <w:b/>
+          <w:color w:val="202124"/>
+          <w:sz w:val="24"/>
+          <w:szCs w:val="24"/>
+          <w:shd w:val="clear" w:color="auto" w:fill="FFFFFF"/>
+        </w:rPr>
+      </w:pPr>
+      <w:r>
+        <w:rPr>
+          <w:rFonts w:ascii="Times New Roman" w:hAnsi="Times New Roman"/>
+          <w:b/>
+          <w:color w:val="202124"/>
+          <w:sz w:val="24"/>
+          <w:szCs w:val="24"/>
+          <w:shd w:val="clear" w:color="auto" w:fill="FFFFFF"/>
+          <w:lang w:val="az-Latn-AZ"/>
+        </w:rPr>
+        <w:t xml:space="preserve">Master:                                              </w:t>
+      </w:r>
+      <w:r>
+        <w:rPr>
+          <w:rFonts w:ascii="Times New Roman" w:hAnsi="Times New Roman"/>
+          <w:b/>
+          <w:color w:val="202124"/>
+          <w:sz w:val="24"/>
+          <w:szCs w:val="24"/>
+          <w:shd w:val="clear" w:color="auto" w:fill="FFFFFF"/>
+          <w:lang w:val="az-Latn-AZ"/>
+        </w:rPr>
+        <w:tab/>
+      </w:r>
+      <w:r>
+        <w:rPr>
+          <w:rFonts w:ascii="Times New Roman" w:hAnsi="Times New Roman"/>
+          <w:b/>
+          <w:color w:val="202124"/>
+          <w:sz w:val="24"/>
+          <w:szCs w:val="24"/>
+          <w:shd w:val="clear" w:color="auto" w:fill="FFFFFF"/>
+          <w:lang w:val="az-Latn-AZ"/>
+        </w:rPr>
+        <w:tab/>
+      </w:r>
+      <w:r>
+        <w:rPr>
+          <w:rFonts w:ascii="Times New Roman" w:hAnsi="Times New Roman"/>
+          <w:b/>
+          <w:color w:val="202124"/>
+          <w:sz w:val="24"/>
+          <w:szCs w:val="24"/>
+          <w:shd w:val="clear" w:color="auto" w:fill="FFFFFF"/>
+          <w:lang w:val="az-Latn-AZ"/>
+        </w:rPr>
+        <w:tab/>
+      </w:r>
+      <w:r>
+        <w:rPr>
+          <w:rFonts w:ascii="Times New Roman" w:hAnsi="Times New Roman"/>
+          <w:b/>
+          <w:color w:val="202124"/>
+          <w:sz w:val="24"/>
+          <w:szCs w:val="24"/>
+          <w:shd w:val="clear" w:color="auto" w:fill="FFFFFF"/>
+          <w:lang w:val="az-Latn-AZ"/>
+        </w:rPr>
+        <w:t>Scientific Supervisor:</w:t>
+      </w:r>
+    </w:p>
+    <w:p>
+      <w:pPr>
+        <w:pStyle w:val="NoSpacing"/>
+        <w:spacing w:line="360" w:lineRule="auto"/>
+        <w:rPr>
+          <w:rFonts w:ascii="Times New Roman" w:hAnsi="Times New Roman"/>
+          <w:b/>
+          <w:sz w:val="24"/>
+          <w:szCs w:val="24"/>
+          <w:shd w:val="clear" w:color="auto" w:fill="FFFFFF"/>
+          <w:lang w:val="az-Latn-AZ"/>
+        </w:rPr>
+      </w:pPr>
       <w:r>
         <w:rPr>
           <w:rFonts w:eastAsia="Calibri" w:cs="Times New Roman"/>
@@ -599,23 +849,17 @@
           <w:bCs/>
           <w:szCs w:val="28"/>
         </w:rPr>
-        <w:t>Artificial Intelligence</w:t>
-      </w:r>
-    </w:p>
-    <w:p>
-      <w:pPr>
-        <w:tabs>
-          <w:tab w:val="left" w:pos="2415"/>
-        </w:tabs>
-        <w:spacing w:after="0"/>
-        <w:ind w:left="-450"/>
+        <w:t>Ulvi Bashirov</w:t>
+      </w:r>
+      <w:r>
         <w:rPr>
           <w:rFonts w:eastAsia="Calibri" w:cs="Times New Roman"/>
           <w:b/>
           <w:bCs/>
           <w:szCs w:val="28"/>
         </w:rPr>
-      </w:pPr>
+        <w:tab/>
+      </w:r>
       <w:r>
         <w:rPr>
           <w:rFonts w:eastAsia="Calibri" w:cs="Times New Roman"/>
@@ -623,7 +867,7 @@
           <w:bCs/>
           <w:szCs w:val="28"/>
         </w:rPr>
-        <w:t xml:space="preserve">Group: </w:t>
+        <w:tab/>
       </w:r>
       <w:r>
         <w:rPr>
@@ -632,739 +876,735 @@
           <w:bCs/>
           <w:szCs w:val="28"/>
         </w:rPr>
-        <w:t>E27-24</w:t>
-      </w:r>
-    </w:p>
-    <w:p>
-      <w:pPr>
-        <w:tabs>
-          <w:tab w:val="left" w:pos="2415"/>
-        </w:tabs>
-        <w:spacing w:after="0"/>
-        <w:ind w:left="-450"/>
+        <w:tab/>
+      </w:r>
+      <w:r>
         <w:rPr>
           <w:rFonts w:eastAsia="Calibri" w:cs="Times New Roman"/>
           <w:b/>
           <w:bCs/>
           <w:szCs w:val="28"/>
         </w:rPr>
-      </w:pPr>
-    </w:p>
-    <w:tbl>
-      <w:tblPr>
-        <w:tblStyle w:val="TableGrid1"/>
-        <w:tblpPr w:leftFromText="180" w:rightFromText="180" w:vertAnchor="text" w:horzAnchor="margin" w:tblpX="-426" w:tblpY="54"/>
-        <w:tblW w:w="9701" w:type="dxa"/>
-        <w:tblBorders>
-          <w:top w:val="none" w:sz="0" w:space="0" w:color="auto"/>
-          <w:left w:val="none" w:sz="0" w:space="0" w:color="auto"/>
-          <w:bottom w:val="none" w:sz="0" w:space="0" w:color="auto"/>
-          <w:right w:val="none" w:sz="0" w:space="0" w:color="auto"/>
-          <w:insideH w:val="none" w:sz="0" w:space="0" w:color="auto"/>
-          <w:insideV w:val="none" w:sz="0" w:space="0" w:color="auto"/>
-        </w:tblBorders>
-        <w:tblLook w:val="04A0" w:firstRow="1" w:lastRow="0" w:firstColumn="1" w:lastColumn="0" w:noHBand="0" w:noVBand="1"/>
-      </w:tblPr>
-      <w:tblGrid>
-        <w:gridCol w:w="4686"/>
-        <w:gridCol w:w="5015"/>
-      </w:tblGrid>
-      <w:tr>
-        <w:trPr>
-          <w:trHeight w:val="2126"/>
-        </w:trPr>
-        <w:tc>
-          <w:tcPr>
-            <w:tcW w:w="4686" w:type="dxa"/>
-          </w:tcPr>
-          <w:p>
-            <w:pPr>
-              <w:tabs>
-                <w:tab w:val="left" w:pos="2415"/>
-              </w:tabs>
-              <w:rPr>
-                <w:rFonts w:eastAsia="Calibri" w:cs="Times New Roman"/>
-                <w:b/>
-                <w:bCs/>
-                <w:szCs w:val="28"/>
-              </w:rPr>
-            </w:pPr>
-            <w:r>
-              <w:rPr>
-                <w:rFonts w:eastAsia="Calibri" w:cs="Times New Roman"/>
-                <w:b/>
-                <w:bCs/>
-                <w:szCs w:val="28"/>
-              </w:rPr>
-              <w:t>Master’s Candidate:</w:t>
-            </w:r>
-            <w:r>
-              <w:rPr>
-                <w:rFonts w:eastAsia="Calibri" w:cs="Times New Roman"/>
-                <w:b/>
-                <w:bCs/>
-                <w:szCs w:val="28"/>
-              </w:rPr>
-              <w:t xml:space="preserve"> Ulvi </w:t>
-            </w:r>
-            <w:proofErr w:type="spellStart"/>
-            <w:r>
-              <w:rPr>
-                <w:rFonts w:eastAsia="Calibri" w:cs="Times New Roman"/>
-                <w:b/>
-                <w:bCs/>
-                <w:szCs w:val="28"/>
-              </w:rPr>
-              <w:t>Bashirov</w:t>
-            </w:r>
-            <w:proofErr w:type="spellEnd"/>
-          </w:p>
-          <w:p>
-            <w:pPr>
-              <w:tabs>
-                <w:tab w:val="left" w:pos="2415"/>
-              </w:tabs>
-              <w:rPr>
-                <w:rFonts w:eastAsia="Calibri" w:cs="Times New Roman"/>
-                <w:b/>
-                <w:bCs/>
-                <w:szCs w:val="28"/>
-              </w:rPr>
-            </w:pPr>
-          </w:p>
-          <w:p>
-            <w:pPr>
-              <w:tabs>
-                <w:tab w:val="left" w:pos="2415"/>
-              </w:tabs>
-              <w:rPr>
-                <w:rFonts w:eastAsia="Calibri" w:cs="Times New Roman"/>
-                <w:b/>
-                <w:bCs/>
-                <w:szCs w:val="28"/>
-              </w:rPr>
-            </w:pPr>
-            <w:r>
-              <w:rPr>
-                <w:rFonts w:eastAsia="Calibri" w:cs="Times New Roman"/>
-                <w:b/>
-                <w:bCs/>
-                <w:szCs w:val="28"/>
-              </w:rPr>
-              <w:t>__________________ signature</w:t>
-            </w:r>
-          </w:p>
-          <w:p>
-            <w:pPr>
-              <w:tabs>
-                <w:tab w:val="left" w:pos="2415"/>
-              </w:tabs>
-              <w:rPr>
-                <w:rFonts w:eastAsia="Calibri" w:cs="Times New Roman"/>
-                <w:b/>
-                <w:bCs/>
-                <w:szCs w:val="28"/>
-              </w:rPr>
-            </w:pPr>
-          </w:p>
-        </w:tc>
-        <w:tc>
-          <w:tcPr>
-            <w:tcW w:w="5015" w:type="dxa"/>
-          </w:tcPr>
-          <w:p>
-            <w:pPr>
-              <w:tabs>
-                <w:tab w:val="left" w:pos="2415"/>
-              </w:tabs>
-              <w:rPr>
-                <w:rFonts w:eastAsia="Calibri" w:cs="Times New Roman"/>
-                <w:b/>
-                <w:bCs/>
-                <w:szCs w:val="28"/>
-              </w:rPr>
-            </w:pPr>
-            <w:r>
-              <w:rPr>
-                <w:rFonts w:eastAsia="Calibri" w:cs="Times New Roman"/>
-                <w:b/>
-                <w:bCs/>
-                <w:szCs w:val="28"/>
-              </w:rPr>
-              <w:t>Scientific Advisor:</w:t>
-            </w:r>
-            <w:r>
-              <w:rPr>
-                <w:rFonts w:eastAsia="Calibri" w:cs="Times New Roman"/>
-                <w:b/>
-                <w:bCs/>
-                <w:szCs w:val="28"/>
-              </w:rPr>
-              <w:t xml:space="preserve"> Khanim </w:t>
-            </w:r>
-            <w:proofErr w:type="spellStart"/>
-            <w:r>
-              <w:rPr>
-                <w:rFonts w:eastAsia="Calibri" w:cs="Times New Roman"/>
-                <w:b/>
-                <w:bCs/>
-                <w:szCs w:val="28"/>
-              </w:rPr>
-              <w:t>Pashayeva</w:t>
-            </w:r>
-            <w:proofErr w:type="spellEnd"/>
-          </w:p>
-          <w:p>
-            <w:pPr>
-              <w:tabs>
-                <w:tab w:val="left" w:pos="2415"/>
-              </w:tabs>
-              <w:rPr>
-                <w:rFonts w:eastAsia="Calibri" w:cs="Times New Roman"/>
-                <w:b/>
-                <w:bCs/>
-                <w:szCs w:val="28"/>
-              </w:rPr>
-            </w:pPr>
-          </w:p>
-          <w:p>
-            <w:pPr>
-              <w:tabs>
-                <w:tab w:val="left" w:pos="2415"/>
-              </w:tabs>
-              <w:rPr>
-                <w:rFonts w:eastAsia="Calibri" w:cs="Times New Roman"/>
-                <w:b/>
-                <w:bCs/>
-                <w:szCs w:val="28"/>
-              </w:rPr>
-            </w:pPr>
-            <w:r>
-              <w:rPr>
-                <w:rFonts w:eastAsia="Calibri" w:cs="Times New Roman"/>
-                <w:b/>
-                <w:bCs/>
-                <w:szCs w:val="28"/>
-              </w:rPr>
-              <w:t>__________________ signature</w:t>
-            </w:r>
-          </w:p>
-        </w:tc>
-      </w:tr>
-      <w:tr>
-        <w:trPr>
-          <w:trHeight w:val="2237"/>
-        </w:trPr>
-        <w:tc>
-          <w:tcPr>
-            <w:tcW w:w="4686" w:type="dxa"/>
-          </w:tcPr>
-          <w:p>
-            <w:pPr>
-              <w:tabs>
-                <w:tab w:val="left" w:pos="2415"/>
-              </w:tabs>
-              <w:rPr>
-                <w:rFonts w:eastAsia="Calibri" w:cs="Times New Roman"/>
-                <w:b/>
-                <w:bCs/>
-                <w:szCs w:val="28"/>
-              </w:rPr>
-            </w:pPr>
-            <w:r>
-              <w:rPr>
-                <w:rFonts w:eastAsia="Calibri" w:cs="Times New Roman"/>
-                <w:b/>
-                <w:bCs/>
-                <w:szCs w:val="28"/>
-              </w:rPr>
-              <w:lastRenderedPageBreak/>
-              <w:t>Program Director:</w:t>
-            </w:r>
-          </w:p>
-          <w:p>
-            <w:pPr>
-              <w:tabs>
-                <w:tab w:val="left" w:pos="2415"/>
-              </w:tabs>
-              <w:rPr>
-                <w:rFonts w:cs="Times New Roman"/>
-                <w:b/>
-                <w:bCs/>
-                <w:szCs w:val="28"/>
-                <w:lang w:eastAsia="en-GB"/>
-              </w:rPr>
-            </w:pPr>
-            <w:proofErr w:type="spellStart"/>
-            <w:r>
-              <w:rPr>
-                <w:rFonts w:cs="Times New Roman"/>
-                <w:b/>
-                <w:bCs/>
-                <w:szCs w:val="28"/>
-                <w:lang w:eastAsia="en-GB"/>
-              </w:rPr>
-              <w:t>i.f.d.</w:t>
-            </w:r>
-            <w:proofErr w:type="spellEnd"/>
-            <w:r>
-              <w:rPr>
-                <w:rFonts w:cs="Times New Roman"/>
-                <w:b/>
-                <w:bCs/>
-                <w:szCs w:val="28"/>
-                <w:lang w:eastAsia="en-GB"/>
-              </w:rPr>
-              <w:t xml:space="preserve">, </w:t>
-            </w:r>
-            <w:proofErr w:type="spellStart"/>
-            <w:r>
-              <w:rPr>
-                <w:rFonts w:cs="Times New Roman"/>
-                <w:b/>
-                <w:bCs/>
-                <w:szCs w:val="28"/>
-                <w:lang w:eastAsia="en-GB"/>
-              </w:rPr>
-              <w:t>Gazanfarli</w:t>
-            </w:r>
-            <w:proofErr w:type="spellEnd"/>
-            <w:r>
-              <w:rPr>
-                <w:rFonts w:cs="Times New Roman"/>
-                <w:b/>
-                <w:bCs/>
-                <w:szCs w:val="28"/>
-                <w:lang w:eastAsia="en-GB"/>
-              </w:rPr>
-              <w:t xml:space="preserve"> Mirvari </w:t>
-            </w:r>
-            <w:proofErr w:type="spellStart"/>
-            <w:r>
-              <w:rPr>
-                <w:rFonts w:cs="Times New Roman"/>
-                <w:b/>
-                <w:bCs/>
-                <w:szCs w:val="28"/>
-                <w:lang w:eastAsia="en-GB"/>
-              </w:rPr>
-              <w:t>Khagani</w:t>
-            </w:r>
-            <w:proofErr w:type="spellEnd"/>
-            <w:r>
-              <w:rPr>
-                <w:rFonts w:cs="Times New Roman"/>
-                <w:b/>
-                <w:bCs/>
-                <w:szCs w:val="28"/>
-                <w:lang w:eastAsia="en-GB"/>
-              </w:rPr>
-              <w:t xml:space="preserve"> </w:t>
-            </w:r>
-          </w:p>
-          <w:p>
-            <w:pPr>
-              <w:tabs>
-                <w:tab w:val="left" w:pos="2415"/>
-              </w:tabs>
-              <w:rPr>
-                <w:rFonts w:cs="Times New Roman"/>
-                <w:b/>
-                <w:bCs/>
-                <w:szCs w:val="28"/>
-                <w:lang w:eastAsia="en-GB"/>
-              </w:rPr>
-            </w:pPr>
-          </w:p>
-          <w:p>
-            <w:pPr>
-              <w:tabs>
-                <w:tab w:val="left" w:pos="2415"/>
-              </w:tabs>
-              <w:rPr>
-                <w:rFonts w:eastAsia="Calibri" w:cs="Times New Roman"/>
-                <w:b/>
-                <w:bCs/>
-                <w:szCs w:val="28"/>
-                <w:highlight w:val="yellow"/>
-              </w:rPr>
-            </w:pPr>
-            <w:r>
-              <w:rPr>
-                <w:rFonts w:cs="Times New Roman"/>
-                <w:b/>
-                <w:bCs/>
-                <w:szCs w:val="28"/>
-                <w:lang w:eastAsia="en-GB"/>
-              </w:rPr>
-              <w:t xml:space="preserve">               </w:t>
-            </w:r>
-          </w:p>
-          <w:p>
-            <w:pPr>
-              <w:tabs>
-                <w:tab w:val="left" w:pos="2415"/>
-              </w:tabs>
-              <w:rPr>
-                <w:rFonts w:eastAsia="Calibri" w:cs="Times New Roman"/>
-                <w:b/>
-                <w:bCs/>
-                <w:szCs w:val="28"/>
-                <w:highlight w:val="yellow"/>
-              </w:rPr>
-            </w:pPr>
-            <w:r>
-              <w:rPr>
-                <w:rFonts w:eastAsia="Calibri" w:cs="Times New Roman"/>
-                <w:b/>
-                <w:bCs/>
-                <w:szCs w:val="28"/>
-              </w:rPr>
-              <w:t xml:space="preserve">_________________ </w:t>
-            </w:r>
-            <w:bookmarkStart w:id="3" w:name="OLE_LINK15"/>
-            <w:r>
-              <w:rPr>
-                <w:rFonts w:eastAsia="Calibri" w:cs="Times New Roman"/>
-                <w:b/>
-                <w:bCs/>
-                <w:szCs w:val="28"/>
-              </w:rPr>
-              <w:t>signature</w:t>
-            </w:r>
-            <w:bookmarkEnd w:id="3"/>
-          </w:p>
-        </w:tc>
-        <w:tc>
-          <w:tcPr>
-            <w:tcW w:w="5015" w:type="dxa"/>
-          </w:tcPr>
-          <w:p>
-            <w:pPr>
-              <w:tabs>
-                <w:tab w:val="left" w:pos="2415"/>
-              </w:tabs>
-              <w:jc w:val="left"/>
-              <w:rPr>
-                <w:rFonts w:eastAsia="Calibri" w:cs="Times New Roman"/>
-                <w:b/>
-                <w:bCs/>
-                <w:szCs w:val="28"/>
-                <w:lang w:val="es-ES"/>
-              </w:rPr>
-            </w:pPr>
-            <w:r>
-              <w:rPr>
-                <w:rFonts w:eastAsia="Calibri" w:cs="Times New Roman"/>
-                <w:b/>
-                <w:bCs/>
-                <w:szCs w:val="28"/>
-                <w:lang w:val="es-ES"/>
-              </w:rPr>
-              <w:t xml:space="preserve">Head </w:t>
-            </w:r>
-            <w:proofErr w:type="spellStart"/>
-            <w:r>
-              <w:rPr>
-                <w:rFonts w:eastAsia="Calibri" w:cs="Times New Roman"/>
-                <w:b/>
-                <w:bCs/>
-                <w:szCs w:val="28"/>
-                <w:lang w:val="es-ES"/>
-              </w:rPr>
-              <w:t>of</w:t>
-            </w:r>
-            <w:proofErr w:type="spellEnd"/>
-            <w:r>
-              <w:rPr>
-                <w:rFonts w:eastAsia="Calibri" w:cs="Times New Roman"/>
-                <w:b/>
-                <w:bCs/>
-                <w:szCs w:val="28"/>
-                <w:lang w:val="es-ES"/>
-              </w:rPr>
-              <w:t xml:space="preserve"> </w:t>
-            </w:r>
-            <w:proofErr w:type="spellStart"/>
-            <w:r>
-              <w:rPr>
-                <w:rFonts w:eastAsia="Calibri" w:cs="Times New Roman"/>
-                <w:b/>
-                <w:bCs/>
-                <w:szCs w:val="28"/>
-                <w:lang w:val="es-ES"/>
-              </w:rPr>
-              <w:t>Department</w:t>
-            </w:r>
-            <w:proofErr w:type="spellEnd"/>
-            <w:r>
-              <w:rPr>
-                <w:rFonts w:eastAsia="Calibri" w:cs="Times New Roman"/>
-                <w:b/>
-                <w:bCs/>
-                <w:szCs w:val="28"/>
-                <w:lang w:val="es-ES"/>
-              </w:rPr>
-              <w:t>:</w:t>
-            </w:r>
-            <w:r>
-              <w:rPr>
-                <w:rFonts w:eastAsia="Calibri" w:cs="Times New Roman"/>
-                <w:b/>
-                <w:bCs/>
-                <w:noProof/>
-                <w:color w:val="000000"/>
-                <w:szCs w:val="28"/>
-                <w:lang w:val="es-ES"/>
-              </w:rPr>
-              <w:t xml:space="preserve"> </w:t>
-            </w:r>
-          </w:p>
-          <w:p>
-            <w:pPr>
-              <w:tabs>
-                <w:tab w:val="left" w:pos="2415"/>
-              </w:tabs>
-              <w:jc w:val="left"/>
-              <w:rPr>
-                <w:rFonts w:cs="Times New Roman"/>
-                <w:b/>
-                <w:bCs/>
-                <w:szCs w:val="28"/>
-                <w:lang w:eastAsia="en-GB"/>
-              </w:rPr>
-            </w:pPr>
-            <w:r>
-              <w:rPr>
-                <w:rFonts w:cs="Times New Roman"/>
-                <w:b/>
-                <w:bCs/>
-                <w:szCs w:val="28"/>
-                <w:lang w:eastAsia="en-GB"/>
-              </w:rPr>
-              <w:t xml:space="preserve">Cand. of </w:t>
-            </w:r>
-            <w:proofErr w:type="spellStart"/>
-            <w:r>
-              <w:rPr>
-                <w:rFonts w:cs="Times New Roman"/>
-                <w:b/>
-                <w:bCs/>
-                <w:szCs w:val="28"/>
-                <w:lang w:eastAsia="en-GB"/>
-              </w:rPr>
-              <w:t>E.Sc</w:t>
-            </w:r>
-            <w:proofErr w:type="spellEnd"/>
-            <w:r>
-              <w:rPr>
-                <w:rFonts w:cs="Times New Roman"/>
-                <w:b/>
-                <w:bCs/>
-                <w:szCs w:val="28"/>
-                <w:lang w:eastAsia="en-GB"/>
-              </w:rPr>
-              <w:t>., Associate prof. Mammadova Sevar Momin.</w:t>
-            </w:r>
-          </w:p>
-          <w:p>
-            <w:pPr>
-              <w:tabs>
-                <w:tab w:val="left" w:pos="2415"/>
-              </w:tabs>
-              <w:jc w:val="left"/>
-              <w:rPr>
-                <w:rFonts w:eastAsia="Calibri" w:cs="Times New Roman"/>
-                <w:b/>
-                <w:bCs/>
-                <w:szCs w:val="28"/>
-              </w:rPr>
-            </w:pPr>
-            <w:r>
-              <w:rPr>
-                <w:rFonts w:eastAsia="Calibri" w:cs="Times New Roman"/>
-                <w:b/>
-                <w:bCs/>
-                <w:szCs w:val="28"/>
-              </w:rPr>
-              <w:t xml:space="preserve"> </w:t>
-            </w:r>
-          </w:p>
-          <w:p>
-            <w:pPr>
-              <w:tabs>
-                <w:tab w:val="left" w:pos="2415"/>
-              </w:tabs>
-              <w:jc w:val="left"/>
-              <w:rPr>
-                <w:rFonts w:eastAsia="Calibri" w:cs="Times New Roman"/>
-                <w:b/>
-                <w:bCs/>
-                <w:szCs w:val="28"/>
-                <w:highlight w:val="yellow"/>
-              </w:rPr>
-            </w:pPr>
-            <w:r>
-              <w:rPr>
-                <w:rFonts w:eastAsia="Calibri" w:cs="Times New Roman"/>
-                <w:b/>
-                <w:bCs/>
-                <w:szCs w:val="28"/>
-              </w:rPr>
-              <w:t>__________________</w:t>
-            </w:r>
-            <w:r>
-              <w:rPr>
-                <w:rFonts w:eastAsia="Calibri" w:cs="Times New Roman"/>
-                <w:b/>
-                <w:bCs/>
-                <w:szCs w:val="28"/>
-              </w:rPr>
-              <w:t xml:space="preserve">_ </w:t>
-            </w:r>
-            <w:r>
-              <w:rPr>
-                <w:rFonts w:eastAsia="Calibri" w:cs="Times New Roman"/>
-                <w:b/>
-                <w:bCs/>
-                <w:szCs w:val="28"/>
-              </w:rPr>
-              <w:t>signature</w:t>
-            </w:r>
-          </w:p>
-        </w:tc>
-      </w:tr>
-    </w:tbl>
-    <w:p>
-      <w:pPr>
-        <w:tabs>
-          <w:tab w:val="left" w:pos="2415"/>
-        </w:tabs>
-        <w:spacing w:after="0"/>
-        <w:ind w:left="-540"/>
-        <w:jc w:val="center"/>
+        <w:tab/>
+      </w:r>
+      <w:r>
         <w:rPr>
           <w:rFonts w:eastAsia="Calibri" w:cs="Times New Roman"/>
-          <w:b/>
-          <w:szCs w:val="28"/>
-        </w:rPr>
-      </w:pPr>
-    </w:p>
-    <w:p>
-      <w:pPr>
-        <w:tabs>
-          <w:tab w:val="left" w:pos="2415"/>
-        </w:tabs>
-        <w:spacing w:after="0"/>
-        <w:ind w:left="-540"/>
-        <w:jc w:val="center"/>
-        <w:rPr>
-          <w:rFonts w:eastAsia="Calibri" w:cs="Times New Roman"/>
-          <w:b/>
-          <w:szCs w:val="28"/>
-        </w:rPr>
-      </w:pPr>
-    </w:p>
-    <w:p>
-      <w:pPr>
-        <w:tabs>
-          <w:tab w:val="left" w:pos="2415"/>
-        </w:tabs>
-        <w:spacing w:after="0"/>
-        <w:rPr>
-          <w:rFonts w:eastAsia="Calibri" w:cs="Times New Roman"/>
-          <w:b/>
-          <w:szCs w:val="28"/>
-        </w:rPr>
-      </w:pPr>
-      <w:r>
-        <w:rPr>
-          <w:rFonts w:eastAsia="Calibri" w:cs="Times New Roman"/>
-          <w:b/>
-          <w:szCs w:val="28"/>
-        </w:rPr>
-        <w:t xml:space="preserve">                                               </w:t>
-      </w:r>
-      <w:r>
-        <w:rPr>
-          <w:rFonts w:eastAsia="Calibri" w:cs="Times New Roman"/>
-          <w:b/>
-          <w:szCs w:val="28"/>
-        </w:rPr>
-        <w:t>BAKU – 202</w:t>
-      </w:r>
-      <w:bookmarkEnd w:id="0"/>
-      <w:r>
-        <w:rPr>
-          <w:rFonts w:eastAsia="Calibri" w:cs="Times New Roman"/>
-          <w:b/>
-          <w:szCs w:val="28"/>
-        </w:rPr>
-        <w:t>6</w:t>
-      </w:r>
-    </w:p>
-    <w:p>
-      <w:pPr>
-        <w:jc w:val="center"/>
-        <w:rPr>
           <w:b/>
           <w:bCs/>
           <w:szCs w:val="28"/>
-          <w:lang w:val="en-AZ"/>
-        </w:rPr>
-      </w:pPr>
-      <w:r>
-        <w:rPr>
+        </w:rPr>
+        <w:tab/>
+      </w:r>
+      <w:r>
+        <w:rPr>
+          <w:rFonts w:eastAsia="Calibri" w:cs="Times New Roman"/>
           <w:b/>
           <w:bCs/>
           <w:szCs w:val="28"/>
-          <w:lang w:val="en-AZ"/>
-        </w:rPr>
-        <w:t>“</w:t>
-      </w:r>
-      <w:r>
-        <w:rPr>
+        </w:rPr>
+        <w:tab/>
+      </w:r>
+      <w:r>
+        <w:rPr>
+          <w:rFonts w:eastAsia="Calibri" w:cs="Times New Roman"/>
           <w:b/>
           <w:bCs/>
           <w:szCs w:val="28"/>
+        </w:rPr>
+        <w:t>Khanim Pashayeva</w:t>
+      </w:r>
+      <w:r>
+        <w:rPr>
+          <w:rFonts w:ascii="Times New Roman" w:hAnsi="Times New Roman"/>
+          <w:b/>
+          <w:sz w:val="24"/>
+          <w:szCs w:val="24"/>
+          <w:shd w:val="clear" w:color="auto" w:fill="FFFFFF"/>
+          <w:lang w:val="az-Latn-AZ"/>
+        </w:rPr>
+        <w:t xml:space="preserve"> </w:t>
+      </w:r>
+    </w:p>
+    <w:p>
+      <w:pPr>
+        <w:pStyle w:val="NoSpacing"/>
+        <w:spacing w:line="360" w:lineRule="auto"/>
+        <w:rPr>
+          <w:rFonts w:ascii="Times New Roman" w:hAnsi="Times New Roman"/>
+          <w:b/>
+          <w:sz w:val="24"/>
+          <w:szCs w:val="24"/>
+          <w:shd w:val="clear" w:color="auto" w:fill="FFFFFF"/>
+        </w:rPr>
+      </w:pPr>
+    </w:p>
+    <w:p>
+      <w:pPr>
+        <w:pStyle w:val="NoSpacing"/>
+        <w:spacing w:line="360" w:lineRule="auto"/>
+        <w:rPr>
+          <w:rFonts w:ascii="Times New Roman" w:hAnsi="Times New Roman"/>
+          <w:b/>
+          <w:sz w:val="24"/>
+          <w:szCs w:val="24"/>
+          <w:shd w:val="clear" w:color="auto" w:fill="FFFFFF"/>
+          <w:lang w:val="az-Latn-AZ"/>
+        </w:rPr>
+      </w:pPr>
+      <w:bookmarkStart w:id="4" w:name="OLE_LINK29"/>
+      <w:r>
+        <w:rPr>
+          <w:rFonts w:ascii="Times New Roman" w:hAnsi="Times New Roman"/>
+          <w:b/>
+          <w:sz w:val="24"/>
+          <w:szCs w:val="24"/>
+          <w:shd w:val="clear" w:color="auto" w:fill="FFFFFF"/>
+          <w:lang w:val="az-Latn-AZ"/>
+        </w:rPr>
+        <w:t xml:space="preserve">_______________________ </w:t>
+      </w:r>
+      <w:bookmarkEnd w:id="4"/>
+      <w:r>
+        <w:rPr>
+          <w:rFonts w:ascii="Times New Roman" w:hAnsi="Times New Roman"/>
+          <w:b/>
+          <w:sz w:val="24"/>
+          <w:szCs w:val="24"/>
+          <w:shd w:val="clear" w:color="auto" w:fill="FFFFFF"/>
+          <w:lang w:val="az-Latn-AZ"/>
+        </w:rPr>
+        <w:t xml:space="preserve">                      </w:t>
+      </w:r>
+      <w:r>
+        <w:rPr>
+          <w:rFonts w:ascii="Times New Roman" w:hAnsi="Times New Roman"/>
+          <w:b/>
+          <w:sz w:val="24"/>
+          <w:szCs w:val="24"/>
+          <w:shd w:val="clear" w:color="auto" w:fill="FFFFFF"/>
+          <w:lang w:val="az-Latn-AZ"/>
+        </w:rPr>
+        <w:tab/>
+      </w:r>
+      <w:r>
+        <w:rPr>
+          <w:rFonts w:ascii="Times New Roman" w:hAnsi="Times New Roman"/>
+          <w:b/>
+          <w:sz w:val="24"/>
+          <w:szCs w:val="24"/>
+          <w:shd w:val="clear" w:color="auto" w:fill="FFFFFF"/>
+          <w:lang w:val="az-Latn-AZ"/>
+        </w:rPr>
+        <w:tab/>
+      </w:r>
+      <w:r>
+        <w:rPr>
+          <w:rFonts w:ascii="Times New Roman" w:hAnsi="Times New Roman"/>
+          <w:b/>
+          <w:sz w:val="24"/>
+          <w:szCs w:val="24"/>
+          <w:shd w:val="clear" w:color="auto" w:fill="FFFFFF"/>
+          <w:lang w:val="az-Latn-AZ"/>
+        </w:rPr>
+        <w:t>_______________________</w:t>
+      </w:r>
+    </w:p>
+    <w:p>
+      <w:pPr>
+        <w:pStyle w:val="NoSpacing"/>
+        <w:spacing w:line="360" w:lineRule="auto"/>
+        <w:rPr>
+          <w:rFonts w:ascii="Times New Roman" w:hAnsi="Times New Roman"/>
+          <w:b/>
+          <w:color w:val="202124"/>
+          <w:sz w:val="24"/>
+          <w:szCs w:val="24"/>
+          <w:shd w:val="clear" w:color="auto" w:fill="FFFFFF"/>
+          <w:lang w:val="az-Latn-AZ"/>
+        </w:rPr>
+      </w:pPr>
+    </w:p>
+    <w:p>
+      <w:pPr>
+        <w:pStyle w:val="NoSpacing"/>
+        <w:spacing w:line="360" w:lineRule="auto"/>
+        <w:rPr>
+          <w:rFonts w:ascii="Times New Roman" w:hAnsi="Times New Roman"/>
+          <w:b/>
+          <w:color w:val="202124"/>
+          <w:sz w:val="24"/>
+          <w:szCs w:val="24"/>
+          <w:shd w:val="clear" w:color="auto" w:fill="FFFFFF"/>
+          <w:lang w:val="az-Latn-AZ"/>
+        </w:rPr>
+      </w:pPr>
+      <w:r>
+        <w:rPr>
+          <w:rFonts w:ascii="Times New Roman" w:hAnsi="Times New Roman"/>
+          <w:b/>
+          <w:color w:val="202124"/>
+          <w:sz w:val="24"/>
+          <w:szCs w:val="24"/>
+          <w:shd w:val="clear" w:color="auto" w:fill="FFFFFF"/>
+          <w:lang w:val="az-Latn-AZ"/>
+        </w:rPr>
+        <w:t xml:space="preserve">Program supervisor                                </w:t>
+      </w:r>
+      <w:r>
+        <w:rPr>
+          <w:rFonts w:ascii="Times New Roman" w:hAnsi="Times New Roman"/>
+          <w:b/>
+          <w:color w:val="202124"/>
+          <w:sz w:val="24"/>
+          <w:szCs w:val="24"/>
+          <w:shd w:val="clear" w:color="auto" w:fill="FFFFFF"/>
+          <w:lang w:val="az-Latn-AZ"/>
+        </w:rPr>
+        <w:tab/>
+      </w:r>
+      <w:r>
+        <w:rPr>
+          <w:rFonts w:ascii="Times New Roman" w:hAnsi="Times New Roman"/>
+          <w:b/>
+          <w:color w:val="202124"/>
+          <w:sz w:val="24"/>
+          <w:szCs w:val="24"/>
+          <w:shd w:val="clear" w:color="auto" w:fill="FFFFFF"/>
+          <w:lang w:val="az-Latn-AZ"/>
+        </w:rPr>
+        <w:tab/>
+      </w:r>
+      <w:r>
+        <w:rPr>
+          <w:rFonts w:ascii="Times New Roman" w:hAnsi="Times New Roman"/>
+          <w:b/>
+          <w:color w:val="202124"/>
+          <w:sz w:val="24"/>
+          <w:szCs w:val="24"/>
+          <w:shd w:val="clear" w:color="auto" w:fill="FFFFFF"/>
+          <w:lang w:val="az-Latn-AZ"/>
+        </w:rPr>
+        <w:t xml:space="preserve"> Head of department</w:t>
+      </w:r>
+    </w:p>
+    <w:p>
+      <w:pPr>
+        <w:pStyle w:val="NoSpacing"/>
+        <w:spacing w:line="360" w:lineRule="auto"/>
+        <w:rPr>
+          <w:rFonts w:ascii="Times New Roman" w:hAnsi="Times New Roman"/>
+          <w:b/>
+          <w:color w:val="202124"/>
+          <w:sz w:val="24"/>
+          <w:szCs w:val="24"/>
+          <w:shd w:val="clear" w:color="auto" w:fill="FFFFFF"/>
+          <w:lang w:val="az-Latn-AZ"/>
+        </w:rPr>
+      </w:pPr>
+      <w:r>
+        <w:rPr>
+          <w:rFonts w:ascii="Times New Roman" w:hAnsi="Times New Roman"/>
+          <w:b/>
+          <w:color w:val="202124"/>
+          <w:sz w:val="24"/>
+          <w:szCs w:val="24"/>
+          <w:shd w:val="clear" w:color="auto" w:fill="FFFFFF"/>
+          <w:lang w:val="az-Latn-AZ"/>
+        </w:rPr>
+        <w:tab/>
+      </w:r>
+      <w:r>
+        <w:rPr>
+          <w:rFonts w:ascii="Times New Roman" w:hAnsi="Times New Roman"/>
+          <w:b/>
+          <w:color w:val="202124"/>
+          <w:sz w:val="24"/>
+          <w:szCs w:val="24"/>
+          <w:shd w:val="clear" w:color="auto" w:fill="FFFFFF"/>
+          <w:lang w:val="az-Latn-AZ"/>
+        </w:rPr>
+        <w:tab/>
+      </w:r>
+      <w:r>
+        <w:rPr>
+          <w:rFonts w:ascii="Times New Roman" w:hAnsi="Times New Roman"/>
+          <w:b/>
+          <w:color w:val="202124"/>
+          <w:sz w:val="24"/>
+          <w:szCs w:val="24"/>
+          <w:shd w:val="clear" w:color="auto" w:fill="FFFFFF"/>
+          <w:lang w:val="az-Latn-AZ"/>
+        </w:rPr>
+        <w:tab/>
+        <w:t xml:space="preserve">                           </w:t>
+      </w:r>
+      <w:r>
+        <w:rPr>
+          <w:rFonts w:ascii="Times New Roman" w:hAnsi="Times New Roman"/>
+          <w:b/>
+          <w:color w:val="202124"/>
+          <w:sz w:val="24"/>
+          <w:szCs w:val="24"/>
+          <w:shd w:val="clear" w:color="auto" w:fill="FFFFFF"/>
+          <w:lang w:val="az-Latn-AZ"/>
+        </w:rPr>
+        <w:tab/>
+      </w:r>
+      <w:r>
+        <w:rPr>
+          <w:rFonts w:ascii="Times New Roman" w:hAnsi="Times New Roman"/>
+          <w:b/>
+          <w:color w:val="202124"/>
+          <w:sz w:val="24"/>
+          <w:szCs w:val="24"/>
+          <w:shd w:val="clear" w:color="auto" w:fill="FFFFFF"/>
+          <w:lang w:val="az-Latn-AZ"/>
+        </w:rPr>
+        <w:tab/>
+        <w:t xml:space="preserve"> </w:t>
+      </w:r>
+      <w:proofErr w:type="spellStart"/>
+      <w:proofErr w:type="gramStart"/>
+      <w:r>
+        <w:rPr>
+          <w:rFonts w:ascii="Times New Roman" w:hAnsi="Times New Roman"/>
+          <w:b/>
+          <w:color w:val="202124"/>
+          <w:sz w:val="24"/>
+          <w:szCs w:val="24"/>
+          <w:shd w:val="clear" w:color="auto" w:fill="FFFFFF"/>
+        </w:rPr>
+        <w:t>Ph.D</w:t>
+      </w:r>
+      <w:proofErr w:type="spellEnd"/>
+      <w:proofErr w:type="gramEnd"/>
+      <w:r>
+        <w:rPr>
+          <w:rFonts w:ascii="Times New Roman" w:hAnsi="Times New Roman"/>
+          <w:b/>
+          <w:color w:val="202124"/>
+          <w:sz w:val="24"/>
+          <w:szCs w:val="24"/>
+          <w:shd w:val="clear" w:color="auto" w:fill="FFFFFF"/>
+        </w:rPr>
+        <w:t xml:space="preserve"> in economics</w:t>
+      </w:r>
+      <w:r>
+        <w:rPr>
+          <w:rFonts w:ascii="Times New Roman" w:hAnsi="Times New Roman"/>
+          <w:b/>
+          <w:color w:val="202124"/>
+          <w:sz w:val="24"/>
+          <w:szCs w:val="24"/>
+          <w:shd w:val="clear" w:color="auto" w:fill="FFFFFF"/>
+          <w:lang w:val="az-Latn-AZ"/>
+        </w:rPr>
+        <w:t xml:space="preserve">, Associate prof. </w:t>
+      </w:r>
+    </w:p>
+    <w:p>
+      <w:pPr>
+        <w:pStyle w:val="NoSpacing"/>
+        <w:spacing w:line="360" w:lineRule="auto"/>
+        <w:rPr>
+          <w:rFonts w:ascii="Times New Roman" w:hAnsi="Times New Roman"/>
+          <w:b/>
+          <w:color w:val="202124"/>
+          <w:sz w:val="24"/>
+          <w:szCs w:val="24"/>
+          <w:shd w:val="clear" w:color="auto" w:fill="FFFFFF"/>
+          <w:lang w:val="az-Latn-AZ"/>
+        </w:rPr>
+      </w:pPr>
+      <w:r>
+        <w:rPr>
+          <w:rFonts w:ascii="Times New Roman" w:hAnsi="Times New Roman"/>
+          <w:b/>
+          <w:color w:val="202124"/>
+          <w:sz w:val="24"/>
+          <w:szCs w:val="24"/>
+          <w:shd w:val="clear" w:color="auto" w:fill="FFFFFF"/>
+          <w:lang w:val="az-Latn-AZ"/>
+        </w:rPr>
+        <w:t>.......................</w:t>
+      </w:r>
+      <w:r>
+        <w:rPr>
+          <w:rFonts w:ascii="Times New Roman" w:hAnsi="Times New Roman"/>
+          <w:b/>
+          <w:color w:val="202124"/>
+          <w:sz w:val="24"/>
+          <w:szCs w:val="24"/>
+          <w:shd w:val="clear" w:color="auto" w:fill="FFFFFF"/>
+          <w:lang w:val="az-Latn-AZ"/>
+        </w:rPr>
+        <w:t xml:space="preserve">                                       </w:t>
+      </w:r>
+      <w:r>
+        <w:rPr>
+          <w:rFonts w:ascii="Times New Roman" w:hAnsi="Times New Roman"/>
+          <w:b/>
+          <w:color w:val="202124"/>
+          <w:sz w:val="24"/>
+          <w:szCs w:val="24"/>
+          <w:shd w:val="clear" w:color="auto" w:fill="FFFFFF"/>
+          <w:lang w:val="az-Latn-AZ"/>
+        </w:rPr>
+        <w:tab/>
+      </w:r>
+      <w:r>
+        <w:rPr>
+          <w:rFonts w:ascii="Times New Roman" w:hAnsi="Times New Roman"/>
+          <w:b/>
+          <w:color w:val="202124"/>
+          <w:sz w:val="24"/>
+          <w:szCs w:val="24"/>
+          <w:shd w:val="clear" w:color="auto" w:fill="FFFFFF"/>
+          <w:lang w:val="az-Latn-AZ"/>
+        </w:rPr>
+        <w:tab/>
+      </w:r>
+      <w:r>
+        <w:rPr>
+          <w:rFonts w:ascii="Times New Roman" w:hAnsi="Times New Roman"/>
+          <w:b/>
+          <w:color w:val="202124"/>
+          <w:sz w:val="24"/>
+          <w:szCs w:val="24"/>
+          <w:shd w:val="clear" w:color="auto" w:fill="FFFFFF"/>
+          <w:lang w:val="az-Latn-AZ"/>
+        </w:rPr>
+        <w:t xml:space="preserve"> Sevar Mammadova </w:t>
+      </w:r>
+    </w:p>
+    <w:p>
+      <w:pPr>
+        <w:pStyle w:val="NoSpacing"/>
+        <w:tabs>
+          <w:tab w:val="center" w:pos="4677"/>
+        </w:tabs>
+        <w:spacing w:line="360" w:lineRule="auto"/>
+        <w:rPr>
+          <w:rFonts w:ascii="Times New Roman" w:hAnsi="Times New Roman"/>
+          <w:b/>
+          <w:color w:val="202124"/>
+          <w:sz w:val="24"/>
+          <w:szCs w:val="24"/>
+          <w:shd w:val="clear" w:color="auto" w:fill="FFFFFF"/>
+          <w:lang w:val="az-Latn-AZ"/>
+        </w:rPr>
+      </w:pPr>
+      <w:r>
+        <w:rPr>
+          <w:rFonts w:ascii="Times New Roman" w:hAnsi="Times New Roman"/>
+          <w:b/>
+          <w:color w:val="202124"/>
+          <w:sz w:val="24"/>
+          <w:szCs w:val="24"/>
+          <w:shd w:val="clear" w:color="auto" w:fill="FFFFFF"/>
+          <w:lang w:val="az-Latn-AZ"/>
+        </w:rPr>
+        <w:t xml:space="preserve">                                                                    </w:t>
+      </w:r>
+    </w:p>
+    <w:p>
+      <w:pPr>
+        <w:pStyle w:val="NoSpacing"/>
+        <w:spacing w:line="360" w:lineRule="auto"/>
+        <w:rPr>
+          <w:rFonts w:ascii="Times New Roman" w:hAnsi="Times New Roman"/>
+          <w:b/>
+          <w:color w:val="202124"/>
+          <w:sz w:val="24"/>
+          <w:szCs w:val="24"/>
+          <w:shd w:val="clear" w:color="auto" w:fill="FFFFFF"/>
+          <w:lang w:val="az-Latn-AZ"/>
+        </w:rPr>
+      </w:pPr>
+      <w:r>
+        <w:rPr>
+          <w:rFonts w:ascii="Times New Roman" w:hAnsi="Times New Roman"/>
+          <w:b/>
+          <w:sz w:val="24"/>
+          <w:szCs w:val="24"/>
+          <w:shd w:val="clear" w:color="auto" w:fill="FFFFFF"/>
+          <w:lang w:val="az-Latn-AZ"/>
+        </w:rPr>
+        <w:t>_______________________</w:t>
+      </w:r>
+      <w:r>
+        <w:rPr>
+          <w:rFonts w:ascii="Times New Roman" w:hAnsi="Times New Roman"/>
+          <w:b/>
+          <w:color w:val="202124"/>
+          <w:sz w:val="24"/>
+          <w:szCs w:val="24"/>
+          <w:shd w:val="clear" w:color="auto" w:fill="FFFFFF"/>
+          <w:lang w:val="az-Latn-AZ"/>
+        </w:rPr>
+        <w:tab/>
+        <w:t xml:space="preserve">       </w:t>
+      </w:r>
+      <w:r>
+        <w:rPr>
+          <w:rFonts w:ascii="Times New Roman" w:hAnsi="Times New Roman"/>
+          <w:b/>
+          <w:color w:val="202124"/>
+          <w:sz w:val="24"/>
+          <w:szCs w:val="24"/>
+          <w:shd w:val="clear" w:color="auto" w:fill="FFFFFF"/>
+          <w:lang w:val="az-Latn-AZ"/>
+        </w:rPr>
+        <w:tab/>
+      </w:r>
+      <w:r>
+        <w:rPr>
+          <w:rFonts w:ascii="Times New Roman" w:hAnsi="Times New Roman"/>
+          <w:b/>
+          <w:color w:val="202124"/>
+          <w:sz w:val="24"/>
+          <w:szCs w:val="24"/>
+          <w:shd w:val="clear" w:color="auto" w:fill="FFFFFF"/>
+          <w:lang w:val="az-Latn-AZ"/>
+        </w:rPr>
+        <w:tab/>
+      </w:r>
+      <w:r>
+        <w:rPr>
+          <w:rFonts w:ascii="Times New Roman" w:hAnsi="Times New Roman"/>
+          <w:b/>
+          <w:color w:val="202124"/>
+          <w:sz w:val="24"/>
+          <w:szCs w:val="24"/>
+          <w:shd w:val="clear" w:color="auto" w:fill="FFFFFF"/>
+          <w:lang w:val="az-Latn-AZ"/>
+        </w:rPr>
+        <w:tab/>
+      </w:r>
+      <w:r>
+        <w:rPr>
+          <w:rFonts w:ascii="Times New Roman" w:hAnsi="Times New Roman"/>
+          <w:b/>
+          <w:sz w:val="24"/>
+          <w:szCs w:val="24"/>
+          <w:shd w:val="clear" w:color="auto" w:fill="FFFFFF"/>
+          <w:lang w:val="az-Latn-AZ"/>
+        </w:rPr>
+        <w:t>_______________________</w:t>
+      </w:r>
+    </w:p>
+    <w:p>
+      <w:pPr>
+        <w:pStyle w:val="NoSpacing"/>
+        <w:spacing w:line="360" w:lineRule="auto"/>
+        <w:rPr>
+          <w:rFonts w:ascii="Times New Roman" w:hAnsi="Times New Roman"/>
+          <w:color w:val="202124"/>
+          <w:sz w:val="24"/>
+          <w:szCs w:val="24"/>
+          <w:shd w:val="clear" w:color="auto" w:fill="FFFFFF"/>
+          <w:lang w:val="az-Latn-AZ"/>
+        </w:rPr>
+      </w:pPr>
+    </w:p>
+    <w:p>
+      <w:pPr>
+        <w:pStyle w:val="NoSpacing"/>
+        <w:spacing w:line="360" w:lineRule="auto"/>
+        <w:rPr>
+          <w:rFonts w:ascii="Times New Roman" w:hAnsi="Times New Roman"/>
+          <w:color w:val="202124"/>
+          <w:sz w:val="24"/>
+          <w:szCs w:val="24"/>
+          <w:shd w:val="clear" w:color="auto" w:fill="FFFFFF"/>
+          <w:lang w:val="az-Latn-AZ"/>
+        </w:rPr>
+      </w:pPr>
+    </w:p>
+    <w:p>
+      <w:pPr>
+        <w:pStyle w:val="NoSpacing"/>
+        <w:spacing w:line="360" w:lineRule="auto"/>
+        <w:jc w:val="center"/>
+        <w:rPr>
+          <w:rFonts w:ascii="Times New Roman" w:hAnsi="Times New Roman"/>
+          <w:b/>
+          <w:color w:val="202124"/>
+          <w:sz w:val="24"/>
+          <w:szCs w:val="24"/>
+          <w:shd w:val="clear" w:color="auto" w:fill="FFFFFF"/>
+          <w:lang w:val="az-Latn-AZ"/>
+        </w:rPr>
+      </w:pPr>
+      <w:r>
+        <w:rPr>
+          <w:rFonts w:ascii="Times New Roman" w:hAnsi="Times New Roman"/>
+          <w:b/>
+          <w:noProof/>
+          <w:color w:val="202124"/>
+          <w:sz w:val="24"/>
+          <w:szCs w:val="24"/>
+          <w:shd w:val="clear" w:color="auto" w:fill="FFFFFF"/>
+          <w:lang w:val="ru-RU" w:eastAsia="ru-RU"/>
+        </w:rPr>
+        <mc:AlternateContent>
+          <mc:Choice Requires="wps">
+            <w:drawing>
+              <wp:anchor distT="0" distB="0" distL="114300" distR="114300" simplePos="0" relativeHeight="251659264" behindDoc="0" locked="0" layoutInCell="1" allowOverlap="1" wp14:anchorId="54E56D7C" wp14:editId="00A61A06">
+                <wp:simplePos x="0" y="0"/>
+                <wp:positionH relativeFrom="column">
+                  <wp:posOffset>5784899</wp:posOffset>
+                </wp:positionH>
+                <wp:positionV relativeFrom="paragraph">
+                  <wp:posOffset>482307</wp:posOffset>
+                </wp:positionV>
+                <wp:extent cx="372794" cy="330102"/>
+                <wp:effectExtent l="0" t="0" r="27305" b="13335"/>
+                <wp:wrapNone/>
+                <wp:docPr id="23" name="Rectangle 23"/>
+                <wp:cNvGraphicFramePr/>
+                <a:graphic xmlns:a="http://schemas.openxmlformats.org/drawingml/2006/main">
+                  <a:graphicData uri="http://schemas.microsoft.com/office/word/2010/wordprocessingShape">
+                    <wps:wsp>
+                      <wps:cNvSpPr/>
+                      <wps:spPr>
+                        <a:xfrm>
+                          <a:off x="0" y="0"/>
+                          <a:ext cx="372794" cy="330102"/>
+                        </a:xfrm>
+                        <a:prstGeom prst="rect">
+                          <a:avLst/>
+                        </a:prstGeom>
+                        <a:solidFill>
+                          <a:schemeClr val="bg1"/>
+                        </a:solidFill>
+                        <a:ln>
+                          <a:solidFill>
+                            <a:schemeClr val="bg1"/>
+                          </a:solidFill>
+                        </a:ln>
+                      </wps:spPr>
+                      <wps:style>
+                        <a:lnRef idx="2">
+                          <a:schemeClr val="accent1">
+                            <a:shade val="50000"/>
+                          </a:schemeClr>
+                        </a:lnRef>
+                        <a:fillRef idx="1">
+                          <a:schemeClr val="accent1"/>
+                        </a:fillRef>
+                        <a:effectRef idx="0">
+                          <a:schemeClr val="accent1"/>
+                        </a:effectRef>
+                        <a:fontRef idx="minor">
+                          <a:schemeClr val="lt1"/>
+                        </a:fontRef>
+                      </wps:style>
+                      <wps:bodyPr rot="0" spcFirstLastPara="0" vertOverflow="overflow" horzOverflow="overflow" vert="horz" wrap="square" lIns="91440" tIns="45720" rIns="91440" bIns="45720" numCol="1" spcCol="0" rtlCol="0" fromWordArt="0" anchor="ctr" anchorCtr="0" forceAA="0" compatLnSpc="1">
+                        <a:prstTxWarp prst="textNoShape">
+                          <a:avLst/>
+                        </a:prstTxWarp>
+                        <a:noAutofit/>
+                      </wps:bodyPr>
+                    </wps:wsp>
+                  </a:graphicData>
+                </a:graphic>
+                <wp14:sizeRelH relativeFrom="margin">
+                  <wp14:pctWidth>0</wp14:pctWidth>
+                </wp14:sizeRelH>
+                <wp14:sizeRelV relativeFrom="margin">
+                  <wp14:pctHeight>0</wp14:pctHeight>
+                </wp14:sizeRelV>
+              </wp:anchor>
+            </w:drawing>
+          </mc:Choice>
+          <mc:Fallback>
+            <w:pict>
+              <v:rect w14:anchorId="5ABA4EA4" id="Rectangle 23" o:spid="_x0000_s1026" style="position:absolute;margin-left:455.5pt;margin-top:38pt;width:29.35pt;height:26pt;z-index:251659264;visibility:visible;mso-wrap-style:square;mso-width-percent:0;mso-height-percent:0;mso-wrap-distance-left:9pt;mso-wrap-distance-top:0;mso-wrap-distance-right:9pt;mso-wrap-distance-bottom:0;mso-position-horizontal:absolute;mso-position-horizontal-relative:text;mso-position-vertical:absolute;mso-position-vertical-relative:text;mso-width-percent:0;mso-height-percent:0;mso-width-relative:margin;mso-height-relative:margin;v-text-anchor:middle" o:gfxdata="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" fillcolor="white [3212]" strokecolor="white [3212]" strokeweight="2pt"/>
+            </w:pict>
+          </mc:Fallback>
+        </mc:AlternateContent>
+      </w:r>
+      <w:r>
+        <w:rPr>
+          <w:rFonts w:ascii="Times New Roman" w:hAnsi="Times New Roman"/>
+          <w:b/>
+          <w:color w:val="202124"/>
+          <w:sz w:val="24"/>
+          <w:szCs w:val="24"/>
+          <w:shd w:val="clear" w:color="auto" w:fill="FFFFFF"/>
+          <w:lang w:val="az-Latn-AZ"/>
+        </w:rPr>
+        <w:t>BAKU – 202</w:t>
+      </w:r>
+      <w:bookmarkEnd w:id="2"/>
+      <w:bookmarkEnd w:id="3"/>
+      <w:r>
+        <w:rPr>
+          <w:rFonts w:ascii="Times New Roman" w:hAnsi="Times New Roman"/>
+          <w:b/>
+          <w:color w:val="202124"/>
+          <w:sz w:val="24"/>
+          <w:szCs w:val="24"/>
+          <w:shd w:val="clear" w:color="auto" w:fill="FFFFFF"/>
+          <w:lang w:val="az-Latn-AZ"/>
+        </w:rPr>
+        <w:t>6</w:t>
+      </w:r>
+      <w:bookmarkEnd w:id="0"/>
+    </w:p>
+    <w:p>
+      <w:pPr>
+        <w:pStyle w:val="NoSpacing"/>
+        <w:spacing w:line="360" w:lineRule="auto"/>
+        <w:jc w:val="center"/>
+        <w:rPr>
+          <w:rFonts w:ascii="Times New Roman" w:hAnsi="Times New Roman"/>
+          <w:b/>
+          <w:color w:val="202124"/>
+          <w:sz w:val="28"/>
+          <w:szCs w:val="28"/>
+          <w:shd w:val="clear" w:color="auto" w:fill="FFFFFF"/>
+          <w:lang w:val="az-Latn-AZ"/>
+        </w:rPr>
+      </w:pPr>
+      <w:r>
+        <w:rPr>
+          <w:b/>
+          <w:bCs/>
+          <w:sz w:val="28"/>
+          <w:szCs w:val="28"/>
           <w:lang w:val="en-AZ"/>
         </w:rPr>
-        <w:t>Design and Development of a Rule-Based TTS System for Azerbaijani Language</w:t>
-      </w:r>
-      <w:r>
+        <w:lastRenderedPageBreak/>
+        <w:t>“Design and Development of a Rule-Based TTS System for Azerbaijani Language”</w:t>
+      </w:r>
+    </w:p>
+    <w:p>
+      <w:pPr>
+        <w:jc w:val="center"/>
+        <w:rPr>
+          <w:szCs w:val="28"/>
+          <w:lang w:val="en-AZ"/>
+        </w:rPr>
+      </w:pPr>
+    </w:p>
+    <w:p>
+      <w:pPr>
+        <w:jc w:val="center"/>
         <w:rPr>
           <w:b/>
           <w:bCs/>
           <w:szCs w:val="28"/>
-          <w:lang w:val="en-AZ"/>
-        </w:rPr>
-        <w:t>”</w:t>
-      </w:r>
-    </w:p>
-    <w:p>
-      <w:pPr>
-        <w:jc w:val="center"/>
-        <w:rPr>
-          <w:szCs w:val="28"/>
-          <w:lang w:val="en-AZ"/>
         </w:rPr>
       </w:pPr>
-    </w:p>
-    <w:p>
-      <w:pPr>
-        <w:jc w:val="center"/>
+      <w:r>
         <w:rPr>
           <w:b/>
           <w:bCs/>
           <w:szCs w:val="28"/>
         </w:rPr>
-      </w:pPr>
-      <w:r>
-        <w:rPr>
-          <w:b/>
-          <w:bCs/>
-          <w:szCs w:val="28"/>
-        </w:rPr>
         <w:t>Abstract</w:t>
       </w:r>
     </w:p>
@@ -1372,7 +1612,7 @@
       <w:pPr>
         <w:spacing w:after="200"/>
       </w:pPr>
-      <w:bookmarkStart w:id="4" w:name="OLE_LINK5"/>
+      <w:bookmarkStart w:id="5" w:name="OLE_LINK5"/>
       <w:r>
         <w:t>This dissertation presents the design and implementation of a rule-based text-to-speech (TTS) synthesis system for the North Azerbaijani language. Azerbaijani is a morphologically complex, agglutinative Turkic language that</w:t>
       </w:r>
@@ -1416,11 +1656,7 @@
         <w:t xml:space="preserve"> </w:t>
       </w:r>
       <w:r>
-        <w:t xml:space="preserve">implementing context-sensitive phonological rules including velar palatalization, the allophonic behavior of the soft consonant ğ, final obstruent </w:t>
-      </w:r>
-      <w:r>
-        <w:lastRenderedPageBreak/>
-        <w:t>devoicing, and nasal assimilation. The stress assignment module</w:t>
+        <w:t>implementing context-sensitive phonological rules including velar palatalization, the allophonic behavior of the soft consonant ğ, final obstruent devoicing, and nasal assimilation. The stress assignment module</w:t>
       </w:r>
       <w:r>
         <w:t xml:space="preserve"> </w:t>
@@ -1465,7 +1701,11 @@
         <w:t xml:space="preserve"> </w:t>
       </w:r>
       <w:r>
-        <w:t>by the rule-based front-end. The system is implemented entirely in Python, validated by a suite of 156-unit tests covering 61 distinct linguistic phenomena, and designed to operate without external speech training data.</w:t>
+        <w:t xml:space="preserve">by the rule-based front-end. The </w:t>
+      </w:r>
+      <w:r>
+        <w:lastRenderedPageBreak/>
+        <w:t>system is implemented entirely in Python, validated by a suite of 156-unit tests covering 61 distinct linguistic phenomena, and designed to operate without external speech training data.</w:t>
       </w:r>
     </w:p>
     <w:p>
@@ -1521,7 +1761,6 @@
           <w:b/>
           <w:bCs/>
         </w:rPr>
-        <w:lastRenderedPageBreak/>
         <w:t>Keywords</w:t>
       </w:r>
       <w:r>
@@ -1542,8 +1781,8 @@
           <w:szCs w:val="28"/>
         </w:rPr>
       </w:pPr>
-      <w:bookmarkStart w:id="5" w:name="OLE_LINK14"/>
-      <w:bookmarkEnd w:id="4"/>
+      <w:bookmarkStart w:id="6" w:name="OLE_LINK14"/>
+      <w:bookmarkEnd w:id="5"/>
       <w:r>
         <w:rPr>
           <w:rFonts w:cs="Times New Roman"/>
@@ -1555,7 +1794,7 @@
         <w:lastRenderedPageBreak/>
         <w:t>ACKNOWLEDGEMENT</w:t>
       </w:r>
-      <w:bookmarkEnd w:id="5"/>
+      <w:bookmarkEnd w:id="6"/>
     </w:p>
     <w:p>
       <w:pPr>
@@ -4561,13 +4800,13 @@
       <w:r>
         <w:br w:type="page"/>
       </w:r>
-      <w:bookmarkStart w:id="6" w:name="_Toc227005160"/>
-      <w:bookmarkStart w:id="7" w:name="OLE_LINK6"/>
+      <w:bookmarkStart w:id="7" w:name="_Toc227005160"/>
+      <w:bookmarkStart w:id="8" w:name="OLE_LINK6"/>
       <w:r>
         <w:lastRenderedPageBreak/>
         <w:t>INTRODUCTION</w:t>
       </w:r>
-      <w:bookmarkEnd w:id="6"/>
+      <w:bookmarkEnd w:id="7"/>
     </w:p>
     <w:p>
       <w:pPr>
@@ -5093,13 +5332,13 @@
       <w:pPr>
         <w:pStyle w:val="Heading1"/>
       </w:pPr>
-      <w:bookmarkStart w:id="8" w:name="_Toc227005161"/>
-      <w:bookmarkEnd w:id="7"/>
+      <w:bookmarkStart w:id="9" w:name="_Toc227005161"/>
+      <w:bookmarkEnd w:id="8"/>
       <w:r>
         <w:lastRenderedPageBreak/>
         <w:t>CHAPTER I. THEORETICAL FOUNDATIONS OF TEXT-TO-SPEECH SYSTEMS</w:t>
       </w:r>
-      <w:bookmarkEnd w:id="8"/>
+      <w:bookmarkEnd w:id="9"/>
     </w:p>
     <w:p>
       <w:pPr>
@@ -5109,21 +5348,21 @@
           <w:numId w:val="10"/>
         </w:numPr>
       </w:pPr>
-      <w:bookmarkStart w:id="9" w:name="_Toc227005162"/>
+      <w:bookmarkStart w:id="10" w:name="_Toc227005162"/>
       <w:r>
         <w:t>General Overview of Text-to-Speech Systems</w:t>
       </w:r>
-      <w:bookmarkEnd w:id="9"/>
+      <w:bookmarkEnd w:id="10"/>
     </w:p>
     <w:p>
       <w:pPr>
         <w:pStyle w:val="Heading3"/>
       </w:pPr>
-      <w:bookmarkStart w:id="10" w:name="_Toc227005163"/>
+      <w:bookmarkStart w:id="11" w:name="_Toc227005163"/>
       <w:r>
         <w:t>1.1.1. Definition and Purpose of Text-to-Speech Technology</w:t>
       </w:r>
-      <w:bookmarkEnd w:id="10"/>
+      <w:bookmarkEnd w:id="11"/>
     </w:p>
     <w:p>
       <w:r>
@@ -5848,11 +6087,11 @@
       <w:pPr>
         <w:pStyle w:val="Heading3"/>
       </w:pPr>
-      <w:bookmarkStart w:id="11" w:name="_Toc227005164"/>
+      <w:bookmarkStart w:id="12" w:name="_Toc227005164"/>
       <w:r>
         <w:t>1.1.2. Core Components of TTS Systems</w:t>
       </w:r>
-      <w:bookmarkEnd w:id="11"/>
+      <w:bookmarkEnd w:id="12"/>
     </w:p>
     <w:p>
       <w:r>
@@ -7175,7 +7414,7 @@
       <w:pPr>
         <w:pStyle w:val="Heading3"/>
       </w:pPr>
-      <w:bookmarkStart w:id="12" w:name="_Toc227005165"/>
+      <w:bookmarkStart w:id="13" w:name="_Toc227005165"/>
       <w:r>
         <w:t xml:space="preserve">1.1.3. </w:t>
       </w:r>
@@ -7185,7 +7424,7 @@
       <w:r>
         <w:t xml:space="preserve"> Development of TTS Technologies</w:t>
       </w:r>
-      <w:bookmarkEnd w:id="12"/>
+      <w:bookmarkEnd w:id="13"/>
     </w:p>
     <w:p>
       <w:pPr>
@@ -8457,7 +8696,7 @@
       <w:pPr>
         <w:pStyle w:val="Heading2"/>
       </w:pPr>
-      <w:bookmarkStart w:id="13" w:name="_Toc227005166"/>
+      <w:bookmarkStart w:id="14" w:name="_Toc227005166"/>
       <w:r>
         <w:t>1.2. Rule-</w:t>
       </w:r>
@@ -8467,13 +8706,13 @@
       <w:r>
         <w:t xml:space="preserve"> Text-to-Speech Systems</w:t>
       </w:r>
-      <w:bookmarkEnd w:id="13"/>
+      <w:bookmarkEnd w:id="14"/>
     </w:p>
     <w:p>
       <w:pPr>
         <w:pStyle w:val="Heading3"/>
       </w:pPr>
-      <w:bookmarkStart w:id="14" w:name="_Toc227005167"/>
+      <w:bookmarkStart w:id="15" w:name="_Toc227005167"/>
       <w:r>
         <w:t>1.2.1. Concept and Principles of Rule-</w:t>
       </w:r>
@@ -8483,7 +8722,7 @@
       <w:r>
         <w:t xml:space="preserve"> TTS</w:t>
       </w:r>
-      <w:bookmarkEnd w:id="14"/>
+      <w:bookmarkEnd w:id="15"/>
     </w:p>
     <w:p>
       <w:r>
@@ -8645,7 +8884,7 @@
       <w:pPr>
         <w:pStyle w:val="Heading3"/>
       </w:pPr>
-      <w:bookmarkStart w:id="15" w:name="_Toc227005168"/>
+      <w:bookmarkStart w:id="16" w:name="_Toc227005168"/>
       <w:r>
         <w:t xml:space="preserve">1.2.2. </w:t>
       </w:r>
@@ -8664,7 +8903,7 @@
       <w:r>
         <w:t>Modeling</w:t>
       </w:r>
-      <w:bookmarkEnd w:id="15"/>
+      <w:bookmarkEnd w:id="16"/>
     </w:p>
     <w:p>
       <w:pPr>
@@ -8798,7 +9037,7 @@
       </w:r>
     </w:p>
     <w:p>
-      <w:bookmarkStart w:id="16" w:name="OLE_LINK7"/>
+      <w:bookmarkStart w:id="17" w:name="OLE_LINK7"/>
       <w:r>
         <w:rPr>
           <w:noProof/>
@@ -8888,7 +9127,7 @@
         <w:t>[Figure 1: G2P conversion process flow diagram — rule application sequence for context-insensitive and context-sensitive rules]</w:t>
       </w:r>
     </w:p>
-    <w:bookmarkEnd w:id="16"/>
+    <w:bookmarkEnd w:id="17"/>
     <w:p>
       <w:r>
         <w:t>[Source: Survey of G2P Conversion Methods (2024). Applied Sciences, 14(24), 11790. https://www.mdpi.com/2076-3417/14/24/11790]</w:t>
@@ -8953,7 +9192,7 @@
       <w:pPr>
         <w:pStyle w:val="Heading3"/>
       </w:pPr>
-      <w:bookmarkStart w:id="17" w:name="_Toc227005169"/>
+      <w:bookmarkStart w:id="18" w:name="_Toc227005169"/>
       <w:r>
         <w:lastRenderedPageBreak/>
         <w:t xml:space="preserve">1.2.3. Comparison with </w:t>
@@ -8964,7 +9203,7 @@
       <w:r>
         <w:t xml:space="preserve"> and Neural TTS Approaches</w:t>
       </w:r>
-      <w:bookmarkEnd w:id="17"/>
+      <w:bookmarkEnd w:id="18"/>
     </w:p>
     <w:p>
       <w:r>
@@ -10292,25 +10531,25 @@
       <w:pPr>
         <w:pStyle w:val="Heading2"/>
       </w:pPr>
-      <w:bookmarkStart w:id="18" w:name="_Toc227005170"/>
+      <w:bookmarkStart w:id="19" w:name="_Toc227005170"/>
       <w:r>
         <w:lastRenderedPageBreak/>
         <w:t>1.3. Advantages and Limitations of Rule-Based TTS Systems: A SWOT Analysis</w:t>
       </w:r>
-      <w:bookmarkEnd w:id="18"/>
+      <w:bookmarkEnd w:id="19"/>
     </w:p>
     <w:p>
       <w:pPr>
         <w:pStyle w:val="Heading3"/>
       </w:pPr>
-      <w:bookmarkStart w:id="19" w:name="_Toc227005171"/>
+      <w:bookmarkStart w:id="20" w:name="_Toc227005171"/>
       <w:r>
         <w:t xml:space="preserve">1.3.1. </w:t>
       </w:r>
       <w:r>
         <w:t>Strengths</w:t>
       </w:r>
-      <w:bookmarkEnd w:id="19"/>
+      <w:bookmarkEnd w:id="20"/>
     </w:p>
     <w:p>
       <w:pPr>
@@ -10473,14 +10712,14 @@
       <w:pPr>
         <w:pStyle w:val="Heading3"/>
       </w:pPr>
-      <w:bookmarkStart w:id="20" w:name="_Toc227005172"/>
+      <w:bookmarkStart w:id="21" w:name="_Toc227005172"/>
       <w:r>
         <w:t xml:space="preserve">1.3.2. </w:t>
       </w:r>
       <w:r>
         <w:t>Weaknesses</w:t>
       </w:r>
-      <w:bookmarkEnd w:id="20"/>
+      <w:bookmarkEnd w:id="21"/>
     </w:p>
     <w:p>
       <w:pPr>
@@ -10624,14 +10863,14 @@
       <w:pPr>
         <w:pStyle w:val="Heading3"/>
       </w:pPr>
-      <w:bookmarkStart w:id="21" w:name="_Toc227005173"/>
+      <w:bookmarkStart w:id="22" w:name="_Toc227005173"/>
       <w:r>
         <w:t xml:space="preserve">1.3.3. </w:t>
       </w:r>
       <w:r>
         <w:t>Opportunities</w:t>
       </w:r>
-      <w:bookmarkEnd w:id="21"/>
+      <w:bookmarkEnd w:id="22"/>
     </w:p>
     <w:p>
       <w:pPr>
@@ -10744,11 +10983,11 @@
       <w:pPr>
         <w:pStyle w:val="Heading3"/>
       </w:pPr>
-      <w:bookmarkStart w:id="22" w:name="_Toc227005174"/>
+      <w:bookmarkStart w:id="23" w:name="_Toc227005174"/>
       <w:r>
         <w:t>1.3.4. Threats</w:t>
       </w:r>
-      <w:bookmarkEnd w:id="22"/>
+      <w:bookmarkEnd w:id="23"/>
     </w:p>
     <w:p>
       <w:pPr>
@@ -10957,7 +11196,7 @@
           <w:szCs w:val="28"/>
         </w:rPr>
       </w:pPr>
-      <w:bookmarkStart w:id="23" w:name="_Toc227005175"/>
+      <w:bookmarkStart w:id="24" w:name="_Toc227005175"/>
       <w:r>
         <w:br w:type="page"/>
       </w:r>
@@ -10976,30 +11215,30 @@
       <w:r>
         <w:t xml:space="preserve"> AND TECHNICAL ANALYSIS FOR AZERBAIJANI TTS</w:t>
       </w:r>
-      <w:bookmarkEnd w:id="23"/>
+      <w:bookmarkEnd w:id="24"/>
     </w:p>
     <w:p>
       <w:pPr>
         <w:pStyle w:val="Heading2"/>
       </w:pPr>
-      <w:bookmarkStart w:id="24" w:name="_Toc227005176"/>
+      <w:bookmarkStart w:id="25" w:name="_Toc227005176"/>
       <w:r>
         <w:t>2.1. Phonetic and Morphological Characteristics of Azerbaijani</w:t>
       </w:r>
-      <w:bookmarkEnd w:id="24"/>
+      <w:bookmarkEnd w:id="25"/>
     </w:p>
     <w:p>
       <w:pPr>
         <w:pStyle w:val="Heading3"/>
       </w:pPr>
-      <w:bookmarkStart w:id="25" w:name="_Toc227005177"/>
+      <w:bookmarkStart w:id="26" w:name="_Toc227005177"/>
       <w:r>
         <w:t xml:space="preserve">2.1.1. Typological Classification and </w:t>
       </w:r>
       <w:r>
         <w:t>Orthography</w:t>
       </w:r>
-      <w:bookmarkEnd w:id="25"/>
+      <w:bookmarkEnd w:id="26"/>
     </w:p>
     <w:p/>
     <w:p>
@@ -11067,11 +11306,11 @@
       <w:pPr>
         <w:pStyle w:val="Heading3"/>
       </w:pPr>
-      <w:bookmarkStart w:id="26" w:name="_Toc227005178"/>
+      <w:bookmarkStart w:id="27" w:name="_Toc227005178"/>
       <w:r>
         <w:t>2.1.2. Phoneme Inventory</w:t>
       </w:r>
-      <w:bookmarkEnd w:id="26"/>
+      <w:bookmarkEnd w:id="27"/>
     </w:p>
     <w:p>
       <w:pPr>
@@ -17068,7 +17307,7 @@
       <w:pPr>
         <w:pStyle w:val="Heading3"/>
       </w:pPr>
-      <w:bookmarkStart w:id="27" w:name="_Toc227005179"/>
+      <w:bookmarkStart w:id="28" w:name="_Toc227005179"/>
       <w:r>
         <w:lastRenderedPageBreak/>
         <w:t xml:space="preserve">2.1.3. Context-Sensitive </w:t>
@@ -17079,7 +17318,7 @@
       <w:r>
         <w:t xml:space="preserve"> Rules</w:t>
       </w:r>
-      <w:bookmarkEnd w:id="27"/>
+      <w:bookmarkEnd w:id="28"/>
     </w:p>
     <w:p>
       <w:r>
@@ -17578,11 +17817,11 @@
       <w:pPr>
         <w:pStyle w:val="Heading3"/>
       </w:pPr>
-      <w:bookmarkStart w:id="28" w:name="_Toc227005180"/>
+      <w:bookmarkStart w:id="29" w:name="_Toc227005180"/>
       <w:r>
         <w:t>2.1.4. Vowel Harmony and Consonant Behavior</w:t>
       </w:r>
-      <w:bookmarkEnd w:id="28"/>
+      <w:bookmarkEnd w:id="29"/>
     </w:p>
     <w:p>
       <w:r>
@@ -17758,12 +17997,12 @@
       <w:r>
         <w:t xml:space="preserve">[Figure 2: </w:t>
       </w:r>
-      <w:bookmarkStart w:id="29" w:name="OLE_LINK8"/>
+      <w:bookmarkStart w:id="30" w:name="OLE_LINK8"/>
       <w:r>
         <w:t>Vowel harmony diagram showing front/back vowel classes and suffix alternation patterns in Azerbaijani]</w:t>
       </w:r>
     </w:p>
-    <w:bookmarkEnd w:id="29"/>
+    <w:bookmarkEnd w:id="30"/>
     <w:p>
       <w:r>
         <w:t xml:space="preserve">[Source: Various authors. (2013). Vowel harmony: A comparative study of Turkish and Azerbaijani Turkish. Procedia — Social and Behavioral Sciences. </w:t>
@@ -17780,7 +18019,7 @@
       <w:pPr>
         <w:pStyle w:val="Heading3"/>
       </w:pPr>
-      <w:bookmarkStart w:id="30" w:name="_Toc227005181"/>
+      <w:bookmarkStart w:id="31" w:name="_Toc227005181"/>
       <w:r>
         <w:t xml:space="preserve">2.1.5. Impact of Agglutinative Morphology on </w:t>
       </w:r>
@@ -17790,7 +18029,7 @@
       <w:r>
         <w:t xml:space="preserve"> Synthesis</w:t>
       </w:r>
-      <w:bookmarkEnd w:id="30"/>
+      <w:bookmarkEnd w:id="31"/>
     </w:p>
     <w:p/>
     <w:p>
@@ -17857,24 +18096,24 @@
       <w:pPr>
         <w:pStyle w:val="Heading2"/>
       </w:pPr>
-      <w:bookmarkStart w:id="31" w:name="_Toc227005182"/>
+      <w:bookmarkStart w:id="32" w:name="_Toc227005182"/>
       <w:r>
         <w:t>2.2. Text Normalization and Linguistic Rule Design</w:t>
       </w:r>
-      <w:bookmarkEnd w:id="31"/>
+      <w:bookmarkEnd w:id="32"/>
     </w:p>
     <w:p>
       <w:pPr>
         <w:pStyle w:val="Heading3"/>
       </w:pPr>
-      <w:bookmarkStart w:id="32" w:name="_Toc227005183"/>
+      <w:bookmarkStart w:id="33" w:name="_Toc227005183"/>
       <w:r>
         <w:t xml:space="preserve">2.2.1. Text Normalization </w:t>
       </w:r>
       <w:r>
         <w:t>Overview</w:t>
       </w:r>
-      <w:bookmarkEnd w:id="32"/>
+      <w:bookmarkEnd w:id="33"/>
     </w:p>
     <w:p>
       <w:r>
@@ -17934,7 +18173,7 @@
       </w:r>
     </w:p>
     <w:p>
-      <w:bookmarkStart w:id="33" w:name="OLE_LINK9"/>
+      <w:bookmarkStart w:id="34" w:name="OLE_LINK9"/>
       <w:r>
         <w:t xml:space="preserve">[Figure </w:t>
       </w:r>
@@ -17945,7 +18184,7 @@
         <w:t>: Text normalization processing cascade — eight steps from raw text to pronounceable Azerbaijani word sequence]</w:t>
       </w:r>
     </w:p>
-    <w:bookmarkEnd w:id="33"/>
+    <w:bookmarkEnd w:id="34"/>
     <w:p>
       <w:r>
         <w:t xml:space="preserve">[Source: NVIDIA. (2020–2024). Text normalization with NVIDIA </w:t>
@@ -17975,7 +18214,7 @@
       <w:pPr>
         <w:pStyle w:val="Heading3"/>
       </w:pPr>
-      <w:bookmarkStart w:id="34" w:name="_Toc227005184"/>
+      <w:bookmarkStart w:id="35" w:name="_Toc227005184"/>
       <w:r>
         <w:t xml:space="preserve">2.2.2. Normalization of Numbers, </w:t>
       </w:r>
@@ -17985,7 +18224,7 @@
       <w:r>
         <w:t>, Dates, and Symbols</w:t>
       </w:r>
-      <w:bookmarkEnd w:id="34"/>
+      <w:bookmarkEnd w:id="35"/>
     </w:p>
     <w:p>
       <w:r>
@@ -19481,7 +19720,7 @@
       <w:pPr>
         <w:pStyle w:val="Heading3"/>
       </w:pPr>
-      <w:bookmarkStart w:id="35" w:name="_Toc227005185"/>
+      <w:bookmarkStart w:id="36" w:name="_Toc227005185"/>
       <w:r>
         <w:t xml:space="preserve">2.2.3. Syllabification and Stress </w:t>
       </w:r>
@@ -19491,7 +19730,7 @@
       <w:r>
         <w:t xml:space="preserve"> Rules</w:t>
       </w:r>
-      <w:bookmarkEnd w:id="35"/>
+      <w:bookmarkEnd w:id="36"/>
     </w:p>
     <w:p>
       <w:r>
@@ -19711,11 +19950,11 @@
       <w:pPr>
         <w:pStyle w:val="Heading3"/>
       </w:pPr>
-      <w:bookmarkStart w:id="36" w:name="_Toc227005186"/>
+      <w:bookmarkStart w:id="37" w:name="_Toc227005186"/>
       <w:r>
         <w:t>2.2.4. Prosodic and Intonation Modeling</w:t>
       </w:r>
-      <w:bookmarkEnd w:id="36"/>
+      <w:bookmarkEnd w:id="37"/>
     </w:p>
     <w:p>
       <w:pPr>
@@ -20917,7 +21156,7 @@
       <w:pPr>
         <w:pStyle w:val="Heading2"/>
       </w:pPr>
-      <w:bookmarkStart w:id="37" w:name="_Toc227005187"/>
+      <w:bookmarkStart w:id="38" w:name="_Toc227005187"/>
       <w:r>
         <w:t xml:space="preserve">2.3. </w:t>
       </w:r>
@@ -20927,19 +21166,19 @@
       <w:r>
         <w:t xml:space="preserve"> of the Rule-Based Azerbaijani TTS System</w:t>
       </w:r>
-      <w:bookmarkEnd w:id="37"/>
+      <w:bookmarkEnd w:id="38"/>
     </w:p>
     <w:p>
       <w:pPr>
         <w:pStyle w:val="Heading3"/>
       </w:pPr>
-      <w:bookmarkStart w:id="38" w:name="_Toc227005188"/>
-      <w:bookmarkStart w:id="39" w:name="OLE_LINK16"/>
+      <w:bookmarkStart w:id="39" w:name="_Toc227005188"/>
+      <w:bookmarkStart w:id="40" w:name="OLE_LINK16"/>
       <w:r>
         <w:t>2.3.1. Overall System Architecture</w:t>
       </w:r>
-      <w:bookmarkEnd w:id="38"/>
       <w:bookmarkEnd w:id="39"/>
+      <w:bookmarkEnd w:id="40"/>
     </w:p>
     <w:p>
       <w:r>
@@ -21048,7 +21287,7 @@
       <w:pPr>
         <w:jc w:val="left"/>
       </w:pPr>
-      <w:bookmarkStart w:id="40" w:name="OLE_LINK10"/>
+      <w:bookmarkStart w:id="41" w:name="OLE_LINK10"/>
       <w:r>
         <w:t xml:space="preserve">[Figure </w:t>
       </w:r>
@@ -21066,7 +21305,7 @@
       <w:r>
         <w:t xml:space="preserve"> architecture from raw text input to WAV output]</w:t>
       </w:r>
-      <w:bookmarkEnd w:id="40"/>
+      <w:bookmarkEnd w:id="41"/>
       <w:r>
         <w:br/>
       </w:r>
@@ -21075,7 +21314,7 @@
       <w:pPr>
         <w:pStyle w:val="Heading3"/>
       </w:pPr>
-      <w:bookmarkStart w:id="41" w:name="_Toc227005189"/>
+      <w:bookmarkStart w:id="42" w:name="_Toc227005189"/>
       <w:r>
         <w:lastRenderedPageBreak/>
         <w:t xml:space="preserve">2.3.2. Module </w:t>
@@ -21083,7 +21322,7 @@
       <w:r>
         <w:t>Decomposition</w:t>
       </w:r>
-      <w:bookmarkEnd w:id="41"/>
+      <w:bookmarkEnd w:id="42"/>
     </w:p>
     <w:p/>
     <w:p>
@@ -21381,11 +21620,11 @@
       <w:pPr>
         <w:pStyle w:val="Heading3"/>
       </w:pPr>
-      <w:bookmarkStart w:id="42" w:name="_Toc227005190"/>
+      <w:bookmarkStart w:id="43" w:name="_Toc227005190"/>
       <w:r>
         <w:t>2.3.3. Data Flow and Rule Execution Logic</w:t>
       </w:r>
-      <w:bookmarkEnd w:id="42"/>
+      <w:bookmarkEnd w:id="43"/>
     </w:p>
     <w:p>
       <w:r>
@@ -21819,7 +22058,7 @@
       </w:r>
     </w:p>
     <w:p>
-      <w:bookmarkStart w:id="43" w:name="OLE_LINK11"/>
+      <w:bookmarkStart w:id="44" w:name="OLE_LINK11"/>
       <w:r>
         <w:t xml:space="preserve">[Figure </w:t>
       </w:r>
@@ -21829,7 +22068,7 @@
       <w:r>
         <w:t>: Data flow diagram showing intermediate representations between each pipeline module]</w:t>
       </w:r>
-      <w:bookmarkEnd w:id="43"/>
+      <w:bookmarkEnd w:id="44"/>
       <w:r>
         <w:br w:type="page"/>
       </w:r>
@@ -21902,7 +22141,7 @@
                 <w:szCs w:val="28"/>
               </w:rPr>
             </w:pPr>
-            <w:bookmarkStart w:id="44" w:name="OLE_LINK19"/>
+            <w:bookmarkStart w:id="45" w:name="OLE_LINK19"/>
             <w:r>
               <w:rPr>
                 <w:rFonts w:cs="Times New Roman"/>
@@ -22438,7 +22677,7 @@
           </w:p>
         </w:tc>
       </w:tr>
-      <w:bookmarkEnd w:id="44"/>
+      <w:bookmarkEnd w:id="45"/>
     </w:tbl>
     <w:p>
       <w:pPr>
@@ -22557,7 +22796,7 @@
       <w:pPr>
         <w:pStyle w:val="Heading1"/>
       </w:pPr>
-      <w:bookmarkStart w:id="45" w:name="_Toc227005191"/>
+      <w:bookmarkStart w:id="46" w:name="_Toc227005191"/>
       <w:r>
         <w:lastRenderedPageBreak/>
         <w:t xml:space="preserve">CHAPTER III. </w:t>
@@ -22568,24 +22807,24 @@
       <w:r>
         <w:t>, IMPLEMENTATION, AND EVALUATION</w:t>
       </w:r>
-      <w:bookmarkEnd w:id="45"/>
+      <w:bookmarkEnd w:id="46"/>
     </w:p>
     <w:p>
       <w:pPr>
         <w:pStyle w:val="Heading2"/>
       </w:pPr>
-      <w:bookmarkStart w:id="46" w:name="_Toc227005192"/>
+      <w:bookmarkStart w:id="47" w:name="_Toc227005192"/>
       <w:r>
         <w:t>3.1. System Design and Development Methodology</w:t>
       </w:r>
-      <w:bookmarkEnd w:id="46"/>
+      <w:bookmarkEnd w:id="47"/>
     </w:p>
     <w:p>
       <w:pPr>
         <w:pStyle w:val="Heading3"/>
       </w:pPr>
-      <w:bookmarkStart w:id="47" w:name="OLE_LINK17"/>
-      <w:bookmarkStart w:id="48" w:name="_Toc227005193"/>
+      <w:bookmarkStart w:id="48" w:name="OLE_LINK17"/>
+      <w:bookmarkStart w:id="49" w:name="_Toc227005193"/>
       <w:r>
         <w:t>3.1.1</w:t>
       </w:r>
@@ -23162,7 +23401,7 @@
       <w:pPr>
         <w:pStyle w:val="Heading3"/>
       </w:pPr>
-      <w:bookmarkStart w:id="49" w:name="OLE_LINK23"/>
+      <w:bookmarkStart w:id="50" w:name="OLE_LINK23"/>
       <w:r>
         <w:t>3.1.3</w:t>
       </w:r>
@@ -23173,7 +23412,7 @@
         <w:t>Tools, Libraries, and Development Environment</w:t>
       </w:r>
     </w:p>
-    <w:bookmarkEnd w:id="49"/>
+    <w:bookmarkEnd w:id="50"/>
     <w:p>
       <w:r>
         <w:t xml:space="preserve">The Azerbaijani TTS system is implemented using Python 3.11 and relies primarily on the Python standard library for its core processing modules. The deliberate </w:t>
@@ -23245,7 +23484,7 @@
                 <w:szCs w:val="28"/>
               </w:rPr>
             </w:pPr>
-            <w:bookmarkStart w:id="50" w:name="OLE_LINK22"/>
+            <w:bookmarkStart w:id="51" w:name="OLE_LINK22"/>
             <w:r>
               <w:rPr>
                 <w:rFonts w:cs="Times New Roman"/>
@@ -23673,7 +23912,7 @@
                 <w:szCs w:val="28"/>
               </w:rPr>
             </w:pPr>
-            <w:bookmarkStart w:id="51" w:name="_Hlk228107124"/>
+            <w:bookmarkStart w:id="52" w:name="_Hlk228107124"/>
             <w:proofErr w:type="spellStart"/>
             <w:r>
               <w:rPr>
@@ -23738,7 +23977,7 @@
           </w:p>
         </w:tc>
       </w:tr>
-      <w:bookmarkEnd w:id="51"/>
+      <w:bookmarkEnd w:id="52"/>
       <w:tr>
         <w:trPr>
           <w:jc w:val="center"/>
@@ -24061,7 +24300,7 @@
           </w:p>
         </w:tc>
       </w:tr>
-      <w:bookmarkEnd w:id="50"/>
+      <w:bookmarkEnd w:id="51"/>
     </w:tbl>
     <w:p/>
     <w:p>
@@ -24119,7 +24358,7 @@
                 <w:szCs w:val="28"/>
               </w:rPr>
             </w:pPr>
-            <w:bookmarkStart w:id="52" w:name="OLE_LINK25"/>
+            <w:bookmarkStart w:id="53" w:name="OLE_LINK25"/>
             <w:r>
               <w:rPr>
                 <w:rFonts w:cs="Times New Roman"/>
@@ -24665,7 +24904,7 @@
           </w:p>
         </w:tc>
       </w:tr>
-      <w:bookmarkEnd w:id="52"/>
+      <w:bookmarkEnd w:id="53"/>
     </w:tbl>
     <w:p/>
     <w:p>
@@ -24844,7 +25083,7 @@
       <w:r>
         <w:t>[</w:t>
       </w:r>
-      <w:bookmarkStart w:id="53" w:name="OLE_LINK18"/>
+      <w:bookmarkStart w:id="54" w:name="OLE_LINK18"/>
       <w:r>
         <w:t xml:space="preserve">Figure </w:t>
       </w:r>
@@ -24864,7 +25103,7 @@
       <w:r>
         <w:t xml:space="preserve"> mode showing pipeline stage outputs for a</w:t>
       </w:r>
-      <w:bookmarkEnd w:id="53"/>
+      <w:bookmarkEnd w:id="54"/>
       <w:r>
         <w:t xml:space="preserve"> </w:t>
       </w:r>
@@ -24921,7 +25160,7 @@
         <w:t>evaluation, with an average execution time of 0.3 milliseconds per sentence on a standard laptop CPU.</w:t>
       </w:r>
     </w:p>
-    <w:bookmarkEnd w:id="47"/>
+    <w:bookmarkEnd w:id="48"/>
     <w:p>
       <w:pPr>
         <w:pStyle w:val="Heading2"/>
@@ -24935,7 +25174,7 @@
       <w:r>
         <w:t xml:space="preserve"> of the Rule-Based TTS Prototype</w:t>
       </w:r>
-      <w:bookmarkEnd w:id="48"/>
+      <w:bookmarkEnd w:id="49"/>
     </w:p>
     <w:p>
       <w:pPr>
@@ -26134,7 +26373,7 @@
       <w:pPr>
         <w:pStyle w:val="Heading3"/>
       </w:pPr>
-      <w:bookmarkStart w:id="54" w:name="OLE_LINK24"/>
+      <w:bookmarkStart w:id="55" w:name="OLE_LINK24"/>
       <w:r>
         <w:t>3.2.3</w:t>
       </w:r>
@@ -26145,7 +26384,7 @@
         <w:t>Audio Signal Generation and Output Processing</w:t>
       </w:r>
     </w:p>
-    <w:bookmarkEnd w:id="54"/>
+    <w:bookmarkEnd w:id="55"/>
     <w:p>
       <w:r>
         <w:t xml:space="preserve">Audio synthesis is performed by the Synthesizer class in synthesizer.py, which acts as a wrapper around the </w:t>
@@ -26655,7 +26894,7 @@
       <w:pPr>
         <w:pStyle w:val="Heading2"/>
       </w:pPr>
-      <w:bookmarkStart w:id="55" w:name="_Toc227005194"/>
+      <w:bookmarkStart w:id="56" w:name="_Toc227005194"/>
       <w:r>
         <w:t xml:space="preserve">3.3. Experimental Evaluation and </w:t>
       </w:r>
@@ -26665,7 +26904,7 @@
       <w:r>
         <w:t xml:space="preserve"> Analysis</w:t>
       </w:r>
-      <w:bookmarkEnd w:id="55"/>
+      <w:bookmarkEnd w:id="56"/>
     </w:p>
     <w:p>
       <w:pPr>
@@ -26984,11 +27223,11 @@
       <w:r>
         <w:t>[</w:t>
       </w:r>
-      <w:bookmarkStart w:id="56" w:name="OLE_LINK27"/>
+      <w:bookmarkStart w:id="57" w:name="OLE_LINK27"/>
       <w:r>
         <w:t>Table</w:t>
       </w:r>
-      <w:bookmarkEnd w:id="56"/>
+      <w:bookmarkEnd w:id="57"/>
       <w:r>
         <w:t xml:space="preserve"> </w:t>
       </w:r>
@@ -27030,7 +27269,7 @@
                 <w:szCs w:val="28"/>
               </w:rPr>
             </w:pPr>
-            <w:bookmarkStart w:id="57" w:name="OLE_LINK28"/>
+            <w:bookmarkStart w:id="58" w:name="OLE_LINK28"/>
             <w:r>
               <w:rPr>
                 <w:rFonts w:cs="Times New Roman"/>
@@ -27136,7 +27375,7 @@
                 <w:szCs w:val="28"/>
               </w:rPr>
             </w:pPr>
-            <w:bookmarkStart w:id="58" w:name="OLE_LINK26"/>
+            <w:bookmarkStart w:id="59" w:name="OLE_LINK26"/>
             <w:r>
               <w:rPr>
                 <w:rFonts w:cs="Times New Roman"/>
@@ -27146,7 +27385,7 @@
               </w:rPr>
               <w:t>E1</w:t>
             </w:r>
-            <w:bookmarkEnd w:id="58"/>
+            <w:bookmarkEnd w:id="59"/>
           </w:p>
         </w:tc>
         <w:tc>
@@ -27646,7 +27885,7 @@
         </w:tc>
       </w:tr>
     </w:tbl>
-    <w:bookmarkEnd w:id="57"/>
+    <w:bookmarkEnd w:id="58"/>
     <w:p>
       <w:r>
         <w:t xml:space="preserve">Speech naturalness was measured using the Mean Opinion Score (MOS) protocol defined in ITU-T P.800. Each evaluator listened to a randomly ordered set of 36 synthesized audio clips — 18 produced by the proposed full pipeline and 18 produced by the unmodified </w:t>
@@ -29361,8 +29600,8 @@
           <w:szCs w:val="28"/>
         </w:rPr>
       </w:pPr>
-      <w:bookmarkStart w:id="59" w:name="_Toc227005195"/>
-      <w:bookmarkStart w:id="60" w:name="OLE_LINK13"/>
+      <w:bookmarkStart w:id="60" w:name="_Toc227005195"/>
+      <w:bookmarkStart w:id="61" w:name="OLE_LINK13"/>
       <w:r>
         <w:t>* Approximate figures from source publications; not directly comparable due to differing evaluation protocols.</w:t>
       </w:r>
@@ -29538,10 +29777,10 @@
         <w:lastRenderedPageBreak/>
         <w:t>CONCLUSION</w:t>
       </w:r>
-      <w:bookmarkEnd w:id="59"/>
+      <w:bookmarkEnd w:id="60"/>
     </w:p>
     <w:bookmarkEnd w:id="1"/>
-    <w:bookmarkEnd w:id="60"/>
+    <w:bookmarkEnd w:id="61"/>
     <w:p>
       <w:pPr>
         <w:rPr>
@@ -33076,7 +33315,7 @@
   <w:style w:type="paragraph" w:default="1" w:styleId="Normal">
     <w:name w:val="Normal"/>
     <w:qFormat/>
-    <w:rsid w:val="00A06525"/>
+    <w:rsid w:val="00514CD6"/>
     <w:pPr>
       <w:spacing w:after="120" w:line="360" w:lineRule="auto"/>
       <w:jc w:val="both"/>
@@ -33300,7 +33539,6 @@
   <w:style w:type="character" w:default="1" w:styleId="DefaultParagraphFont">
     <w:name w:val="Default Paragraph Font"/>
     <w:uiPriority w:val="1"/>
-    <w:semiHidden/>
     <w:unhideWhenUsed/>
   </w:style>
   <w:style w:type="table" w:default="1" w:styleId="TableNormal">

</xml_diff>